<commit_message>
feat: implement document loader, recursive text splitter and hybrid embedding factory
</commit_message>
<xml_diff>
--- a/LLMOps_setup.docx
+++ b/LLMOps_setup.docx
@@ -135,13 +135,8 @@
           <w:numId w:val="2"/>
         </w:numPr>
       </w:pPr>
-      <w:proofErr w:type="spellStart"/>
-      <w:r>
-        <w:t>uv</w:t>
-      </w:r>
-      <w:proofErr w:type="spellEnd"/>
-      <w:r>
-        <w:t xml:space="preserve"> 0.10.0 (0ba432459 2026-02-05)</w:t>
+      <w:r>
+        <w:t>uv 0.10.0 (0ba432459 2026-02-05)</w:t>
       </w:r>
       <w:r>
         <w:t xml:space="preserve"> this version installed in our project</w:t>
@@ -155,155 +150,183 @@
           <w:numId w:val="2"/>
         </w:numPr>
       </w:pPr>
-      <w:proofErr w:type="spellStart"/>
-      <w:r>
-        <w:t>uv</w:t>
-      </w:r>
-      <w:proofErr w:type="spellEnd"/>
+      <w:r>
+        <w:t>uv init .</w:t>
+      </w:r>
+      <w:r>
+        <w:t xml:space="preserve"> (This command is used for python setup used in vs code)</w:t>
+      </w:r>
+    </w:p>
+    <w:p>
+      <w:pPr>
+        <w:pStyle w:val="ListParagraph"/>
+        <w:numPr>
+          <w:ilvl w:val="0"/>
+          <w:numId w:val="2"/>
+        </w:numPr>
+      </w:pPr>
+      <w:r>
+        <w:t>uv venv .venv</w:t>
+      </w:r>
+      <w:r>
+        <w:t xml:space="preserve"> (This command for virtual environment)</w:t>
+      </w:r>
+    </w:p>
+    <w:p>
+      <w:pPr>
+        <w:pStyle w:val="ListParagraph"/>
+        <w:numPr>
+          <w:ilvl w:val="0"/>
+          <w:numId w:val="2"/>
+        </w:numPr>
+      </w:pPr>
+      <w:r>
+        <w:t>uv add ipykernel</w:t>
+      </w:r>
+      <w:r>
+        <w:t xml:space="preserve"> (This is for jupyter notebook environment)</w:t>
+      </w:r>
+    </w:p>
+    <w:p>
+      <w:pPr>
+        <w:pStyle w:val="ListParagraph"/>
+        <w:numPr>
+          <w:ilvl w:val="0"/>
+          <w:numId w:val="2"/>
+        </w:numPr>
+      </w:pPr>
+      <w:r>
+        <w:t>uv sync (check on internet uses of this command)</w:t>
+      </w:r>
+    </w:p>
+    <w:p>
+      <w:pPr>
+        <w:pStyle w:val="ListParagraph"/>
+        <w:numPr>
+          <w:ilvl w:val="0"/>
+          <w:numId w:val="2"/>
+        </w:numPr>
+      </w:pPr>
+    </w:p>
+    <w:p>
+      <w:pPr>
+        <w:pStyle w:val="ListParagraph"/>
+        <w:numPr>
+          <w:ilvl w:val="0"/>
+          <w:numId w:val="2"/>
+        </w:numPr>
+      </w:pPr>
+      <w:r>
+        <w:t>LLMOps/</w:t>
+      </w:r>
+    </w:p>
+    <w:p>
+      <w:pPr>
+        <w:pStyle w:val="ListParagraph"/>
+        <w:numPr>
+          <w:ilvl w:val="0"/>
+          <w:numId w:val="2"/>
+        </w:numPr>
+      </w:pPr>
+      <w:r>
+        <w:t>│</w:t>
+      </w:r>
+    </w:p>
+    <w:p>
+      <w:pPr>
+        <w:pStyle w:val="ListParagraph"/>
+        <w:numPr>
+          <w:ilvl w:val="0"/>
+          <w:numId w:val="2"/>
+        </w:numPr>
+      </w:pPr>
+      <w:r>
+        <w:rPr>
+          <w:rFonts w:ascii="MS Gothic" w:eastAsia="MS Gothic" w:hAnsi="MS Gothic" w:cs="MS Gothic" w:hint="eastAsia"/>
+        </w:rPr>
+        <w:t>├</w:t>
+      </w:r>
+      <w:r>
+        <w:rPr>
+          <w:rFonts w:ascii="Calibri" w:hAnsi="Calibri" w:cs="Calibri"/>
+        </w:rPr>
+        <w:t>──</w:t>
+      </w:r>
+      <w:r>
+        <w:t xml:space="preserve"> data/(This folder stores all the input documents that your AI system will read and learn from</w:t>
+      </w:r>
+      <w:r>
+        <w:t>.</w:t>
+      </w:r>
       <w:r>
         <w:t xml:space="preserve"> </w:t>
       </w:r>
-      <w:proofErr w:type="spellStart"/>
-      <w:r>
-        <w:t>init</w:t>
-      </w:r>
-      <w:proofErr w:type="spellEnd"/>
-      <w:r>
-        <w:t xml:space="preserve"> .</w:t>
-      </w:r>
-      <w:r>
-        <w:t xml:space="preserve"> (This command is used for python setup used in vs code)</w:t>
-      </w:r>
-    </w:p>
-    <w:p>
-      <w:pPr>
-        <w:pStyle w:val="ListParagraph"/>
-        <w:numPr>
-          <w:ilvl w:val="0"/>
-          <w:numId w:val="2"/>
-        </w:numPr>
-      </w:pPr>
-      <w:proofErr w:type="spellStart"/>
-      <w:r>
-        <w:t>uv</w:t>
-      </w:r>
-      <w:proofErr w:type="spellEnd"/>
+      <w:r>
+        <w:t>These can be text files, PDFs, Word documents, or any knowledge base files</w:t>
+      </w:r>
+      <w:r>
+        <w:t>)</w:t>
+      </w:r>
+    </w:p>
+    <w:p>
+      <w:pPr>
+        <w:pStyle w:val="ListParagraph"/>
+        <w:numPr>
+          <w:ilvl w:val="0"/>
+          <w:numId w:val="2"/>
+        </w:numPr>
+      </w:pPr>
+      <w:r>
+        <w:t>│</w:t>
+      </w:r>
+    </w:p>
+    <w:p>
+      <w:pPr>
+        <w:pStyle w:val="ListParagraph"/>
+        <w:numPr>
+          <w:ilvl w:val="0"/>
+          <w:numId w:val="2"/>
+        </w:numPr>
+      </w:pPr>
+      <w:r>
+        <w:rPr>
+          <w:rFonts w:ascii="MS Gothic" w:eastAsia="MS Gothic" w:hAnsi="MS Gothic" w:cs="MS Gothic" w:hint="eastAsia"/>
+        </w:rPr>
+        <w:t>├</w:t>
+      </w:r>
+      <w:r>
+        <w:rPr>
+          <w:rFonts w:ascii="Calibri" w:hAnsi="Calibri" w:cs="Calibri"/>
+        </w:rPr>
+        <w:t>──</w:t>
+      </w:r>
+      <w:r>
+        <w:t xml:space="preserve"> multi_doc_chat/</w:t>
+      </w:r>
+      <w:r>
+        <w:t>(</w:t>
+      </w:r>
       <w:r>
         <w:t xml:space="preserve"> </w:t>
       </w:r>
-      <w:proofErr w:type="spellStart"/>
-      <w:r>
-        <w:t>venv</w:t>
-      </w:r>
-      <w:proofErr w:type="spellEnd"/>
-      <w:r>
-        <w:t xml:space="preserve"> .</w:t>
-      </w:r>
-      <w:proofErr w:type="spellStart"/>
-      <w:r>
-        <w:t>venv</w:t>
-      </w:r>
-      <w:proofErr w:type="spellEnd"/>
-      <w:r>
-        <w:t xml:space="preserve"> (This command for virtual environment)</w:t>
-      </w:r>
-    </w:p>
-    <w:p>
-      <w:pPr>
-        <w:pStyle w:val="ListParagraph"/>
-        <w:numPr>
-          <w:ilvl w:val="0"/>
-          <w:numId w:val="2"/>
-        </w:numPr>
-      </w:pPr>
-      <w:proofErr w:type="spellStart"/>
-      <w:r>
-        <w:t>uv</w:t>
-      </w:r>
-      <w:proofErr w:type="spellEnd"/>
-      <w:r>
-        <w:t xml:space="preserve"> add </w:t>
-      </w:r>
-      <w:proofErr w:type="spellStart"/>
-      <w:r>
-        <w:t>ipykernel</w:t>
-      </w:r>
-      <w:proofErr w:type="spellEnd"/>
-      <w:r>
-        <w:t xml:space="preserve"> (This is for </w:t>
-      </w:r>
-      <w:proofErr w:type="spellStart"/>
-      <w:r>
-        <w:t>jupyter</w:t>
-      </w:r>
-      <w:proofErr w:type="spellEnd"/>
-      <w:r>
-        <w:t xml:space="preserve"> notebook environment)</w:t>
-      </w:r>
-    </w:p>
-    <w:p>
-      <w:pPr>
-        <w:pStyle w:val="ListParagraph"/>
-        <w:numPr>
-          <w:ilvl w:val="0"/>
-          <w:numId w:val="2"/>
-        </w:numPr>
-      </w:pPr>
-      <w:proofErr w:type="spellStart"/>
-      <w:r>
-        <w:t>uv</w:t>
-      </w:r>
-      <w:proofErr w:type="spellEnd"/>
-      <w:r>
-        <w:t xml:space="preserve"> sync (check on internet uses of this command)</w:t>
-      </w:r>
-    </w:p>
-    <w:p>
-      <w:pPr>
-        <w:pStyle w:val="ListParagraph"/>
-        <w:numPr>
-          <w:ilvl w:val="0"/>
-          <w:numId w:val="2"/>
-        </w:numPr>
-      </w:pPr>
-    </w:p>
-    <w:p>
-      <w:pPr>
-        <w:pStyle w:val="ListParagraph"/>
-        <w:numPr>
-          <w:ilvl w:val="0"/>
-          <w:numId w:val="2"/>
-        </w:numPr>
-      </w:pPr>
-      <w:proofErr w:type="spellStart"/>
-      <w:r>
-        <w:t>LLMOps</w:t>
-      </w:r>
-      <w:proofErr w:type="spellEnd"/>
-      <w:r>
-        <w:t>/</w:t>
-      </w:r>
-    </w:p>
-    <w:p>
-      <w:pPr>
-        <w:pStyle w:val="ListParagraph"/>
-        <w:numPr>
-          <w:ilvl w:val="0"/>
-          <w:numId w:val="2"/>
-        </w:numPr>
-      </w:pPr>
-      <w:r>
-        <w:t>│</w:t>
-      </w:r>
-    </w:p>
-    <w:p>
-      <w:pPr>
-        <w:pStyle w:val="ListParagraph"/>
-        <w:numPr>
-          <w:ilvl w:val="0"/>
-          <w:numId w:val="2"/>
-        </w:numPr>
-      </w:pPr>
+      <w:r>
+        <w:t>This is the main application folder where all AI logic and system modules are written. It contains all components required to build the RAG chatbot.</w:t>
+      </w:r>
+      <w:r>
+        <w:t>)</w:t>
+      </w:r>
+    </w:p>
+    <w:p>
+      <w:pPr>
+        <w:pStyle w:val="ListParagraph"/>
+        <w:numPr>
+          <w:ilvl w:val="0"/>
+          <w:numId w:val="2"/>
+        </w:numPr>
+      </w:pPr>
+      <w:r>
+        <w:t xml:space="preserve">│   </w:t>
+      </w:r>
       <w:r>
         <w:rPr>
           <w:rFonts w:ascii="MS Gothic" w:eastAsia="MS Gothic" w:hAnsi="MS Gothic" w:cs="MS Gothic" w:hint="eastAsia"/>
@@ -317,16 +340,56 @@
         <w:t>──</w:t>
       </w:r>
       <w:r>
-        <w:t xml:space="preserve"> data/(This folder stores all the input documents that your AI system will read and learn from</w:t>
-      </w:r>
-      <w:r>
-        <w:t>.</w:t>
+        <w:t xml:space="preserve"> config/ (</w:t>
+      </w:r>
+      <w:r>
+        <w:t>Stores project settings like chunk size, model name, database paths, and environment configuration. It helps avoid hardcoding values inside code.</w:t>
+      </w:r>
+      <w:r>
+        <w:t>)</w:t>
+      </w:r>
+    </w:p>
+    <w:p>
+      <w:pPr>
+        <w:pStyle w:val="ListParagraph"/>
+        <w:numPr>
+          <w:ilvl w:val="0"/>
+          <w:numId w:val="2"/>
+        </w:numPr>
+      </w:pPr>
+      <w:r>
+        <w:t xml:space="preserve">│   </w:t>
+      </w:r>
+      <w:r>
+        <w:rPr>
+          <w:rFonts w:ascii="MS Gothic" w:eastAsia="MS Gothic" w:hAnsi="MS Gothic" w:cs="MS Gothic" w:hint="eastAsia"/>
+        </w:rPr>
+        <w:t>├</w:t>
+      </w:r>
+      <w:r>
+        <w:rPr>
+          <w:rFonts w:ascii="Calibri" w:hAnsi="Calibri" w:cs="Calibri"/>
+        </w:rPr>
+        <w:t>──</w:t>
+      </w:r>
+      <w:r>
+        <w:t xml:space="preserve"> exceptions/(</w:t>
+      </w:r>
+      <w:r>
+        <w:t xml:space="preserve">Handles </w:t>
+      </w:r>
+      <w:r>
+        <w:rPr>
+          <w:b/>
+          <w:bCs/>
+        </w:rPr>
+        <w:t>errors safely and professionally</w:t>
       </w:r>
       <w:r>
         <w:t xml:space="preserve"> </w:t>
       </w:r>
       <w:r>
-        <w:t>These can be text files, PDFs, Word documents, or any knowledge base files</w:t>
+        <w:t>and makes debugging easier.</w:t>
       </w:r>
       <w:r>
         <w:t>)</w:t>
@@ -341,17 +404,8 @@
         </w:numPr>
       </w:pPr>
       <w:r>
-        <w:t>│</w:t>
-      </w:r>
-    </w:p>
-    <w:p>
-      <w:pPr>
-        <w:pStyle w:val="ListParagraph"/>
-        <w:numPr>
-          <w:ilvl w:val="0"/>
-          <w:numId w:val="2"/>
-        </w:numPr>
-      </w:pPr>
+        <w:t xml:space="preserve">│   </w:t>
+      </w:r>
       <w:r>
         <w:rPr>
           <w:rFonts w:ascii="MS Gothic" w:eastAsia="MS Gothic" w:hAnsi="MS Gothic" w:cs="MS Gothic" w:hint="eastAsia"/>
@@ -365,24 +419,49 @@
         <w:t>──</w:t>
       </w:r>
       <w:r>
+        <w:t xml:space="preserve"> logger/(</w:t>
+      </w:r>
+      <w:r>
         <w:t xml:space="preserve"> </w:t>
       </w:r>
-      <w:proofErr w:type="spellStart"/>
-      <w:r>
-        <w:t>multi_doc_chat</w:t>
-      </w:r>
-      <w:proofErr w:type="spellEnd"/>
-      <w:r>
-        <w:t>/</w:t>
-      </w:r>
-      <w:r>
-        <w:t>(</w:t>
+      <w:r>
+        <w:t>Records system activities like loading documents, model calls, failures, and debugging logs. This helps track system performance and errors.</w:t>
+      </w:r>
+      <w:r>
+        <w:t>)</w:t>
+      </w:r>
+    </w:p>
+    <w:p>
+      <w:pPr>
+        <w:pStyle w:val="ListParagraph"/>
+        <w:numPr>
+          <w:ilvl w:val="0"/>
+          <w:numId w:val="2"/>
+        </w:numPr>
+      </w:pPr>
+      <w:r>
+        <w:t xml:space="preserve">│   </w:t>
+      </w:r>
+      <w:r>
+        <w:rPr>
+          <w:rFonts w:ascii="MS Gothic" w:eastAsia="MS Gothic" w:hAnsi="MS Gothic" w:cs="MS Gothic" w:hint="eastAsia"/>
+        </w:rPr>
+        <w:t>├</w:t>
+      </w:r>
+      <w:r>
+        <w:rPr>
+          <w:rFonts w:ascii="Calibri" w:hAnsi="Calibri" w:cs="Calibri"/>
+        </w:rPr>
+        <w:t>──</w:t>
+      </w:r>
+      <w:r>
+        <w:t xml:space="preserve"> loaders/(</w:t>
       </w:r>
       <w:r>
         <w:t xml:space="preserve"> </w:t>
       </w:r>
       <w:r>
-        <w:t>This is the main application folder where all AI logic and system modules are written. It contains all components required to build the RAG chatbot.</w:t>
+        <w:t>Loads documents from different sources like TXT, PDF, or directories and converts them into LangChain document format.</w:t>
       </w:r>
       <w:r>
         <w:t>)</w:t>
@@ -412,10 +491,13 @@
         <w:t>──</w:t>
       </w:r>
       <w:r>
-        <w:t xml:space="preserve"> config/ (</w:t>
-      </w:r>
-      <w:r>
-        <w:t>Stores project settings like chunk size, model name, database paths, and environment configuration. It helps avoid hardcoding values inside code.</w:t>
+        <w:t xml:space="preserve"> splitter/(</w:t>
+      </w:r>
+      <w:r>
+        <w:t xml:space="preserve"> </w:t>
+      </w:r>
+      <w:r>
+        <w:t>Breaks large documents into smaller chunks so that embeddings and retrieval work efficiently.</w:t>
       </w:r>
       <w:r>
         <w:t>)</w:t>
@@ -445,23 +527,10 @@
         <w:t>──</w:t>
       </w:r>
       <w:r>
-        <w:t xml:space="preserve"> exceptions/(</w:t>
-      </w:r>
-      <w:r>
-        <w:t xml:space="preserve">Handles </w:t>
-      </w:r>
-      <w:r>
-        <w:rPr>
-          <w:b/>
-          <w:bCs/>
-        </w:rPr>
-        <w:t>errors safely and professionally</w:t>
-      </w:r>
-      <w:r>
-        <w:t xml:space="preserve"> </w:t>
-      </w:r>
-      <w:r>
-        <w:t>and makes debugging easier.</w:t>
+        <w:t xml:space="preserve"> embeddings/(</w:t>
+      </w:r>
+      <w:r>
+        <w:t>Converts text chunks into numerical vectors that AI models can understand and compare.</w:t>
       </w:r>
       <w:r>
         <w:t>)</w:t>
@@ -491,164 +560,7 @@
         <w:t>──</w:t>
       </w:r>
       <w:r>
-        <w:t xml:space="preserve"> logger/(</w:t>
-      </w:r>
-      <w:r>
-        <w:t xml:space="preserve"> </w:t>
-      </w:r>
-      <w:r>
-        <w:t>Records system activities like loading documents, model calls, failures, and debugging logs. This helps track system performance and errors.</w:t>
-      </w:r>
-      <w:r>
-        <w:t>)</w:t>
-      </w:r>
-    </w:p>
-    <w:p>
-      <w:pPr>
-        <w:pStyle w:val="ListParagraph"/>
-        <w:numPr>
-          <w:ilvl w:val="0"/>
-          <w:numId w:val="2"/>
-        </w:numPr>
-      </w:pPr>
-      <w:r>
-        <w:t xml:space="preserve">│   </w:t>
-      </w:r>
-      <w:r>
-        <w:rPr>
-          <w:rFonts w:ascii="MS Gothic" w:eastAsia="MS Gothic" w:hAnsi="MS Gothic" w:cs="MS Gothic" w:hint="eastAsia"/>
-        </w:rPr>
-        <w:t>├</w:t>
-      </w:r>
-      <w:r>
-        <w:rPr>
-          <w:rFonts w:ascii="Calibri" w:hAnsi="Calibri" w:cs="Calibri"/>
-        </w:rPr>
-        <w:t>──</w:t>
-      </w:r>
-      <w:r>
-        <w:t xml:space="preserve"> loaders/(</w:t>
-      </w:r>
-      <w:r>
-        <w:t xml:space="preserve"> </w:t>
-      </w:r>
-      <w:r>
-        <w:t xml:space="preserve">Loads documents from different sources like TXT, PDF, or directories and converts them into </w:t>
-      </w:r>
-      <w:proofErr w:type="spellStart"/>
-      <w:r>
-        <w:t>LangChain</w:t>
-      </w:r>
-      <w:proofErr w:type="spellEnd"/>
-      <w:r>
-        <w:t xml:space="preserve"> document format.</w:t>
-      </w:r>
-      <w:r>
-        <w:t>)</w:t>
-      </w:r>
-    </w:p>
-    <w:p>
-      <w:pPr>
-        <w:pStyle w:val="ListParagraph"/>
-        <w:numPr>
-          <w:ilvl w:val="0"/>
-          <w:numId w:val="2"/>
-        </w:numPr>
-      </w:pPr>
-      <w:r>
-        <w:t xml:space="preserve">│   </w:t>
-      </w:r>
-      <w:r>
-        <w:rPr>
-          <w:rFonts w:ascii="MS Gothic" w:eastAsia="MS Gothic" w:hAnsi="MS Gothic" w:cs="MS Gothic" w:hint="eastAsia"/>
-        </w:rPr>
-        <w:t>├</w:t>
-      </w:r>
-      <w:r>
-        <w:rPr>
-          <w:rFonts w:ascii="Calibri" w:hAnsi="Calibri" w:cs="Calibri"/>
-        </w:rPr>
-        <w:t>──</w:t>
-      </w:r>
-      <w:r>
-        <w:t xml:space="preserve"> splitter/(</w:t>
-      </w:r>
-      <w:r>
-        <w:t xml:space="preserve"> </w:t>
-      </w:r>
-      <w:r>
-        <w:t>Breaks large documents into smaller chunks so that embeddings and retrieval work efficiently.</w:t>
-      </w:r>
-      <w:r>
-        <w:t>)</w:t>
-      </w:r>
-    </w:p>
-    <w:p>
-      <w:pPr>
-        <w:pStyle w:val="ListParagraph"/>
-        <w:numPr>
-          <w:ilvl w:val="0"/>
-          <w:numId w:val="2"/>
-        </w:numPr>
-      </w:pPr>
-      <w:r>
-        <w:t xml:space="preserve">│   </w:t>
-      </w:r>
-      <w:r>
-        <w:rPr>
-          <w:rFonts w:ascii="MS Gothic" w:eastAsia="MS Gothic" w:hAnsi="MS Gothic" w:cs="MS Gothic" w:hint="eastAsia"/>
-        </w:rPr>
-        <w:t>├</w:t>
-      </w:r>
-      <w:r>
-        <w:rPr>
-          <w:rFonts w:ascii="Calibri" w:hAnsi="Calibri" w:cs="Calibri"/>
-        </w:rPr>
-        <w:t>──</w:t>
-      </w:r>
-      <w:r>
-        <w:t xml:space="preserve"> embeddings/(</w:t>
-      </w:r>
-      <w:r>
-        <w:t>Converts text chunks into numerical vectors that AI models can understand and compare.</w:t>
-      </w:r>
-      <w:r>
-        <w:t>)</w:t>
-      </w:r>
-    </w:p>
-    <w:p>
-      <w:pPr>
-        <w:pStyle w:val="ListParagraph"/>
-        <w:numPr>
-          <w:ilvl w:val="0"/>
-          <w:numId w:val="2"/>
-        </w:numPr>
-      </w:pPr>
-      <w:r>
-        <w:t xml:space="preserve">│   </w:t>
-      </w:r>
-      <w:r>
-        <w:rPr>
-          <w:rFonts w:ascii="MS Gothic" w:eastAsia="MS Gothic" w:hAnsi="MS Gothic" w:cs="MS Gothic" w:hint="eastAsia"/>
-        </w:rPr>
-        <w:t>├</w:t>
-      </w:r>
-      <w:r>
-        <w:rPr>
-          <w:rFonts w:ascii="Calibri" w:hAnsi="Calibri" w:cs="Calibri"/>
-        </w:rPr>
-        <w:t>──</w:t>
-      </w:r>
-      <w:r>
-        <w:t xml:space="preserve"> </w:t>
-      </w:r>
-      <w:proofErr w:type="spellStart"/>
-      <w:r>
-        <w:t>vectorstore</w:t>
-      </w:r>
-      <w:proofErr w:type="spellEnd"/>
-      <w:r>
-        <w:t>/(</w:t>
+        <w:t xml:space="preserve"> vectorstore/(</w:t>
       </w:r>
       <w:r>
         <w:t>Stores embeddings into vector databases like FAISS or Chroma and allows fast similarity search.</w:t>
@@ -731,29 +643,13 @@
         <w:t>──</w:t>
       </w:r>
       <w:r>
+        <w:t xml:space="preserve"> llm/(</w:t>
+      </w:r>
+      <w:r>
         <w:t xml:space="preserve"> </w:t>
       </w:r>
-      <w:proofErr w:type="spellStart"/>
-      <w:r>
-        <w:t>llm</w:t>
-      </w:r>
-      <w:proofErr w:type="spellEnd"/>
-      <w:r>
-        <w:t>/(</w:t>
-      </w:r>
-      <w:r>
-        <w:t xml:space="preserve"> </w:t>
-      </w:r>
-      <w:r>
-        <w:t xml:space="preserve">Contains Large Language Model logic such as OpenAI, </w:t>
-      </w:r>
-      <w:proofErr w:type="spellStart"/>
-      <w:r>
-        <w:t>Ollama</w:t>
-      </w:r>
-      <w:proofErr w:type="spellEnd"/>
-      <w:r>
-        <w:t>, or other LLM integrations used to generate final answers.</w:t>
+      <w:r>
+        <w:t>Contains Large Language Model logic such as OpenAI, Ollama, or other LLM integrations used to generate final answers.</w:t>
       </w:r>
       <w:r>
         <w:t>)</w:t>
@@ -958,15 +854,7 @@
         <w:ind w:firstLine="720"/>
       </w:pPr>
       <w:r>
-        <w:t xml:space="preserve">Real </w:t>
-      </w:r>
-      <w:proofErr w:type="spellStart"/>
-      <w:r>
-        <w:t>LLMOps</w:t>
-      </w:r>
-      <w:proofErr w:type="spellEnd"/>
-      <w:r>
-        <w:t xml:space="preserve"> systems follow separation of concerns:</w:t>
+        <w:t>Real LLMOps systems follow separation of concerns:</w:t>
       </w:r>
     </w:p>
     <w:p>
@@ -1046,7 +934,6 @@
         </w:rPr>
         <w:t xml:space="preserve">Q. What is diff b/w </w:t>
       </w:r>
-      <w:proofErr w:type="spellStart"/>
       <w:r>
         <w:rPr>
           <w:b/>
@@ -1054,29 +941,12 @@
         </w:rPr>
         <w:t>pyproject.toml</w:t>
       </w:r>
-      <w:proofErr w:type="spellEnd"/>
-      <w:r>
-        <w:rPr>
-          <w:b/>
-          <w:bCs/>
-        </w:rPr>
-        <w:t xml:space="preserve"> and </w:t>
-      </w:r>
-      <w:proofErr w:type="spellStart"/>
-      <w:r>
-        <w:rPr>
-          <w:b/>
-          <w:bCs/>
-        </w:rPr>
-        <w:t>uv.lock</w:t>
-      </w:r>
-      <w:proofErr w:type="spellEnd"/>
-      <w:r>
-        <w:rPr>
-          <w:b/>
-          <w:bCs/>
-        </w:rPr>
-        <w:t>?</w:t>
+      <w:r>
+        <w:rPr>
+          <w:b/>
+          <w:bCs/>
+        </w:rPr>
+        <w:t xml:space="preserve"> and uv.lock?</w:t>
       </w:r>
     </w:p>
     <w:p>
@@ -1118,9 +988,19 @@
           <w:szCs w:val="21"/>
           <w14:ligatures w14:val="none"/>
         </w:rPr>
-        <w:t xml:space="preserve">! </w:t>
-      </w:r>
-      <w:proofErr w:type="spellStart"/>
+        <w:t>! uv pip install langchain openai tiktoken rapidocr</w:t>
+      </w:r>
+      <w:r>
+        <w:rPr>
+          <w:rFonts w:ascii="Consolas" w:eastAsia="Times New Roman" w:hAnsi="Consolas" w:cs="Times New Roman"/>
+          <w:color w:val="D4D4D4"/>
+          <w:kern w:val="0"/>
+          <w:sz w:val="21"/>
+          <w:szCs w:val="21"/>
+          <w14:ligatures w14:val="none"/>
+        </w:rPr>
+        <w:t>-</w:t>
+      </w:r>
       <w:r>
         <w:rPr>
           <w:rFonts w:ascii="Consolas" w:eastAsia="Times New Roman" w:hAnsi="Consolas" w:cs="Times New Roman"/>
@@ -1130,9 +1010,19 @@
           <w:szCs w:val="21"/>
           <w14:ligatures w14:val="none"/>
         </w:rPr>
-        <w:t>uv</w:t>
-      </w:r>
-      <w:proofErr w:type="spellEnd"/>
+        <w:t>onnxruntime python</w:t>
+      </w:r>
+      <w:r>
+        <w:rPr>
+          <w:rFonts w:ascii="Consolas" w:eastAsia="Times New Roman" w:hAnsi="Consolas" w:cs="Times New Roman"/>
+          <w:color w:val="D4D4D4"/>
+          <w:kern w:val="0"/>
+          <w:sz w:val="21"/>
+          <w:szCs w:val="21"/>
+          <w14:ligatures w14:val="none"/>
+        </w:rPr>
+        <w:t>-</w:t>
+      </w:r>
       <w:r>
         <w:rPr>
           <w:rFonts w:ascii="Consolas" w:eastAsia="Times New Roman" w:hAnsi="Consolas" w:cs="Times New Roman"/>
@@ -1142,9 +1032,19 @@
           <w:szCs w:val="21"/>
           <w14:ligatures w14:val="none"/>
         </w:rPr>
-        <w:t xml:space="preserve"> pip install </w:t>
-      </w:r>
-      <w:proofErr w:type="spellStart"/>
+        <w:t>dotenv langchain</w:t>
+      </w:r>
+      <w:r>
+        <w:rPr>
+          <w:rFonts w:ascii="Consolas" w:eastAsia="Times New Roman" w:hAnsi="Consolas" w:cs="Times New Roman"/>
+          <w:color w:val="D4D4D4"/>
+          <w:kern w:val="0"/>
+          <w:sz w:val="21"/>
+          <w:szCs w:val="21"/>
+          <w14:ligatures w14:val="none"/>
+        </w:rPr>
+        <w:t>-</w:t>
+      </w:r>
       <w:r>
         <w:rPr>
           <w:rFonts w:ascii="Consolas" w:eastAsia="Times New Roman" w:hAnsi="Consolas" w:cs="Times New Roman"/>
@@ -1154,182 +1054,6 @@
           <w:szCs w:val="21"/>
           <w14:ligatures w14:val="none"/>
         </w:rPr>
-        <w:t>langchain</w:t>
-      </w:r>
-      <w:proofErr w:type="spellEnd"/>
-      <w:r>
-        <w:rPr>
-          <w:rFonts w:ascii="Consolas" w:eastAsia="Times New Roman" w:hAnsi="Consolas" w:cs="Times New Roman"/>
-          <w:color w:val="CCCCCC"/>
-          <w:kern w:val="0"/>
-          <w:sz w:val="21"/>
-          <w:szCs w:val="21"/>
-          <w14:ligatures w14:val="none"/>
-        </w:rPr>
-        <w:t xml:space="preserve"> </w:t>
-      </w:r>
-      <w:proofErr w:type="spellStart"/>
-      <w:r>
-        <w:rPr>
-          <w:rFonts w:ascii="Consolas" w:eastAsia="Times New Roman" w:hAnsi="Consolas" w:cs="Times New Roman"/>
-          <w:color w:val="CCCCCC"/>
-          <w:kern w:val="0"/>
-          <w:sz w:val="21"/>
-          <w:szCs w:val="21"/>
-          <w14:ligatures w14:val="none"/>
-        </w:rPr>
-        <w:t>openai</w:t>
-      </w:r>
-      <w:proofErr w:type="spellEnd"/>
-      <w:r>
-        <w:rPr>
-          <w:rFonts w:ascii="Consolas" w:eastAsia="Times New Roman" w:hAnsi="Consolas" w:cs="Times New Roman"/>
-          <w:color w:val="CCCCCC"/>
-          <w:kern w:val="0"/>
-          <w:sz w:val="21"/>
-          <w:szCs w:val="21"/>
-          <w14:ligatures w14:val="none"/>
-        </w:rPr>
-        <w:t xml:space="preserve"> </w:t>
-      </w:r>
-      <w:proofErr w:type="spellStart"/>
-      <w:r>
-        <w:rPr>
-          <w:rFonts w:ascii="Consolas" w:eastAsia="Times New Roman" w:hAnsi="Consolas" w:cs="Times New Roman"/>
-          <w:color w:val="CCCCCC"/>
-          <w:kern w:val="0"/>
-          <w:sz w:val="21"/>
-          <w:szCs w:val="21"/>
-          <w14:ligatures w14:val="none"/>
-        </w:rPr>
-        <w:t>tiktoken</w:t>
-      </w:r>
-      <w:proofErr w:type="spellEnd"/>
-      <w:r>
-        <w:rPr>
-          <w:rFonts w:ascii="Consolas" w:eastAsia="Times New Roman" w:hAnsi="Consolas" w:cs="Times New Roman"/>
-          <w:color w:val="CCCCCC"/>
-          <w:kern w:val="0"/>
-          <w:sz w:val="21"/>
-          <w:szCs w:val="21"/>
-          <w14:ligatures w14:val="none"/>
-        </w:rPr>
-        <w:t xml:space="preserve"> </w:t>
-      </w:r>
-      <w:proofErr w:type="spellStart"/>
-      <w:r>
-        <w:rPr>
-          <w:rFonts w:ascii="Consolas" w:eastAsia="Times New Roman" w:hAnsi="Consolas" w:cs="Times New Roman"/>
-          <w:color w:val="CCCCCC"/>
-          <w:kern w:val="0"/>
-          <w:sz w:val="21"/>
-          <w:szCs w:val="21"/>
-          <w14:ligatures w14:val="none"/>
-        </w:rPr>
-        <w:t>rapidocr</w:t>
-      </w:r>
-      <w:r>
-        <w:rPr>
-          <w:rFonts w:ascii="Consolas" w:eastAsia="Times New Roman" w:hAnsi="Consolas" w:cs="Times New Roman"/>
-          <w:color w:val="D4D4D4"/>
-          <w:kern w:val="0"/>
-          <w:sz w:val="21"/>
-          <w:szCs w:val="21"/>
-          <w14:ligatures w14:val="none"/>
-        </w:rPr>
-        <w:t>-</w:t>
-      </w:r>
-      <w:r>
-        <w:rPr>
-          <w:rFonts w:ascii="Consolas" w:eastAsia="Times New Roman" w:hAnsi="Consolas" w:cs="Times New Roman"/>
-          <w:color w:val="CCCCCC"/>
-          <w:kern w:val="0"/>
-          <w:sz w:val="21"/>
-          <w:szCs w:val="21"/>
-          <w14:ligatures w14:val="none"/>
-        </w:rPr>
-        <w:t>onnxruntime</w:t>
-      </w:r>
-      <w:proofErr w:type="spellEnd"/>
-      <w:r>
-        <w:rPr>
-          <w:rFonts w:ascii="Consolas" w:eastAsia="Times New Roman" w:hAnsi="Consolas" w:cs="Times New Roman"/>
-          <w:color w:val="CCCCCC"/>
-          <w:kern w:val="0"/>
-          <w:sz w:val="21"/>
-          <w:szCs w:val="21"/>
-          <w14:ligatures w14:val="none"/>
-        </w:rPr>
-        <w:t xml:space="preserve"> python</w:t>
-      </w:r>
-      <w:r>
-        <w:rPr>
-          <w:rFonts w:ascii="Consolas" w:eastAsia="Times New Roman" w:hAnsi="Consolas" w:cs="Times New Roman"/>
-          <w:color w:val="D4D4D4"/>
-          <w:kern w:val="0"/>
-          <w:sz w:val="21"/>
-          <w:szCs w:val="21"/>
-          <w14:ligatures w14:val="none"/>
-        </w:rPr>
-        <w:t>-</w:t>
-      </w:r>
-      <w:proofErr w:type="spellStart"/>
-      <w:r>
-        <w:rPr>
-          <w:rFonts w:ascii="Consolas" w:eastAsia="Times New Roman" w:hAnsi="Consolas" w:cs="Times New Roman"/>
-          <w:color w:val="CCCCCC"/>
-          <w:kern w:val="0"/>
-          <w:sz w:val="21"/>
-          <w:szCs w:val="21"/>
-          <w14:ligatures w14:val="none"/>
-        </w:rPr>
-        <w:t>dotenv</w:t>
-      </w:r>
-      <w:proofErr w:type="spellEnd"/>
-      <w:r>
-        <w:rPr>
-          <w:rFonts w:ascii="Consolas" w:eastAsia="Times New Roman" w:hAnsi="Consolas" w:cs="Times New Roman"/>
-          <w:color w:val="CCCCCC"/>
-          <w:kern w:val="0"/>
-          <w:sz w:val="21"/>
-          <w:szCs w:val="21"/>
-          <w14:ligatures w14:val="none"/>
-        </w:rPr>
-        <w:t xml:space="preserve"> </w:t>
-      </w:r>
-      <w:proofErr w:type="spellStart"/>
-      <w:r>
-        <w:rPr>
-          <w:rFonts w:ascii="Consolas" w:eastAsia="Times New Roman" w:hAnsi="Consolas" w:cs="Times New Roman"/>
-          <w:color w:val="CCCCCC"/>
-          <w:kern w:val="0"/>
-          <w:sz w:val="21"/>
-          <w:szCs w:val="21"/>
-          <w14:ligatures w14:val="none"/>
-        </w:rPr>
-        <w:t>langchain</w:t>
-      </w:r>
-      <w:proofErr w:type="spellEnd"/>
-      <w:r>
-        <w:rPr>
-          <w:rFonts w:ascii="Consolas" w:eastAsia="Times New Roman" w:hAnsi="Consolas" w:cs="Times New Roman"/>
-          <w:color w:val="D4D4D4"/>
-          <w:kern w:val="0"/>
-          <w:sz w:val="21"/>
-          <w:szCs w:val="21"/>
-          <w14:ligatures w14:val="none"/>
-        </w:rPr>
-        <w:t>-</w:t>
-      </w:r>
-      <w:r>
-        <w:rPr>
-          <w:rFonts w:ascii="Consolas" w:eastAsia="Times New Roman" w:hAnsi="Consolas" w:cs="Times New Roman"/>
-          <w:color w:val="CCCCCC"/>
-          <w:kern w:val="0"/>
-          <w:sz w:val="21"/>
-          <w:szCs w:val="21"/>
-          <w14:ligatures w14:val="none"/>
-        </w:rPr>
         <w:t>community</w:t>
       </w:r>
     </w:p>
@@ -1341,13 +1065,8 @@
           <w:numId w:val="2"/>
         </w:numPr>
       </w:pPr>
-      <w:proofErr w:type="spellStart"/>
-      <w:r>
-        <w:t>uv</w:t>
-      </w:r>
-      <w:proofErr w:type="spellEnd"/>
-      <w:r>
-        <w:t xml:space="preserve"> pip list</w:t>
+      <w:r>
+        <w:t>uv pip list</w:t>
       </w:r>
       <w:r>
         <w:t xml:space="preserve">  (This is use for check the packages list that are installed and used our project)</w:t>
@@ -1390,9 +1109,89 @@
           <w:b/>
           <w:bCs/>
         </w:rPr>
+        <w:t>HuggingFaceEmbeddings</w:t>
+      </w:r>
+      <w:r>
+        <w:rPr>
+          <w:b/>
+          <w:bCs/>
+        </w:rPr>
+        <w:t>?</w:t>
+      </w:r>
+    </w:p>
+    <w:p>
+      <w:pPr>
+        <w:pStyle w:val="ListParagraph"/>
+        <w:numPr>
+          <w:ilvl w:val="0"/>
+          <w:numId w:val="2"/>
+        </w:numPr>
+        <w:rPr>
+          <w:b/>
+          <w:bCs/>
+        </w:rPr>
+      </w:pPr>
+      <w:r>
+        <w:rPr>
+          <w:b/>
+          <w:bCs/>
+        </w:rPr>
+        <w:t>OpenAIEmbeddings</w:t>
+      </w:r>
+      <w:r>
+        <w:rPr>
+          <w:b/>
+          <w:bCs/>
+        </w:rPr>
+        <w:t>?</w:t>
+      </w:r>
+    </w:p>
+    <w:p>
+      <w:pPr>
+        <w:pStyle w:val="ListParagraph"/>
+        <w:numPr>
+          <w:ilvl w:val="0"/>
+          <w:numId w:val="2"/>
+        </w:numPr>
+        <w:rPr>
+          <w:b/>
+          <w:bCs/>
+        </w:rPr>
+      </w:pPr>
+      <w:r>
+        <w:rPr>
+          <w:b/>
+          <w:bCs/>
+        </w:rPr>
+        <w:t>EmbeddingFactory</w:t>
+      </w:r>
+      <w:r>
+        <w:rPr>
+          <w:b/>
+          <w:bCs/>
+        </w:rPr>
+        <w:t>?</w:t>
+      </w:r>
+    </w:p>
+    <w:p>
+      <w:pPr>
+        <w:pStyle w:val="ListParagraph"/>
+        <w:numPr>
+          <w:ilvl w:val="0"/>
+          <w:numId w:val="2"/>
+        </w:numPr>
+        <w:rPr>
+          <w:b/>
+          <w:bCs/>
+        </w:rPr>
+      </w:pPr>
+      <w:r>
+        <w:rPr>
+          <w:b/>
+          <w:bCs/>
+        </w:rPr>
         <w:t xml:space="preserve">What is </w:t>
       </w:r>
-      <w:proofErr w:type="spellStart"/>
       <w:r>
         <w:rPr>
           <w:b/>
@@ -1400,39 +1199,13 @@
         </w:rPr>
         <w:t>RecursiveCharacterTextSplitter</w:t>
       </w:r>
-      <w:proofErr w:type="spellEnd"/>
-      <w:r>
-        <w:rPr>
-          <w:b/>
-          <w:bCs/>
-        </w:rPr>
-        <w:t xml:space="preserve">, </w:t>
-      </w:r>
-      <w:proofErr w:type="spellStart"/>
-      <w:r>
-        <w:rPr>
-          <w:b/>
-          <w:bCs/>
-        </w:rPr>
-        <w:t>chunk_size</w:t>
-      </w:r>
-      <w:proofErr w:type="spellEnd"/>
-      <w:r>
-        <w:rPr>
-          <w:b/>
-          <w:bCs/>
-        </w:rPr>
-        <w:t xml:space="preserve"> &amp; </w:t>
-      </w:r>
-      <w:proofErr w:type="spellStart"/>
-      <w:r>
-        <w:rPr>
-          <w:b/>
-          <w:bCs/>
-        </w:rPr>
-        <w:t>chunk_overlap</w:t>
-      </w:r>
-      <w:proofErr w:type="spellEnd"/>
+      <w:r>
+        <w:rPr>
+          <w:b/>
+          <w:bCs/>
+        </w:rPr>
+        <w:t>, chunk_size &amp; chunk_overlap</w:t>
+      </w:r>
       <w:r>
         <w:rPr>
           <w:b/>
@@ -1453,7 +1226,6 @@
           <w:bCs/>
         </w:rPr>
       </w:pPr>
-      <w:proofErr w:type="spellStart"/>
       <w:r>
         <w:rPr>
           <w:b/>
@@ -1461,7 +1233,6 @@
         </w:rPr>
         <w:t>Chunkviz.up.railway.app</w:t>
       </w:r>
-      <w:proofErr w:type="spellEnd"/>
     </w:p>
     <w:p>
       <w:pPr>
@@ -1512,39 +1283,8 @@
           <w:b/>
           <w:bCs/>
         </w:rPr>
-        <w:t xml:space="preserve">I developed a production-ready full-stack </w:t>
-      </w:r>
-      <w:proofErr w:type="spellStart"/>
-      <w:r>
-        <w:rPr>
-          <w:b/>
-          <w:bCs/>
-        </w:rPr>
-        <w:t>LLMOps</w:t>
-      </w:r>
-      <w:proofErr w:type="spellEnd"/>
-      <w:r>
-        <w:rPr>
-          <w:b/>
-          <w:bCs/>
-        </w:rPr>
-        <w:t xml:space="preserve"> RAG chat system with modular architecture using </w:t>
-      </w:r>
-      <w:proofErr w:type="spellStart"/>
-      <w:r>
-        <w:rPr>
-          <w:b/>
-          <w:bCs/>
-        </w:rPr>
-        <w:t>FastAPI</w:t>
-      </w:r>
-      <w:proofErr w:type="spellEnd"/>
-      <w:r>
-        <w:rPr>
-          <w:b/>
-          <w:bCs/>
-        </w:rPr>
-        <w:t xml:space="preserve"> backend and Next.js frontend with centralized logging and error handling.</w:t>
+        <w:lastRenderedPageBreak/>
+        <w:t>I developed a production-ready full-stack LLMOps RAG chat system with modular architecture using FastAPI backend and Next.js frontend with centralized logging and error handling.</w:t>
       </w:r>
     </w:p>
     <w:p>
@@ -1555,37 +1295,12 @@
           <w:bCs/>
         </w:rPr>
       </w:pPr>
-      <w:proofErr w:type="spellStart"/>
-      <w:r>
-        <w:rPr>
-          <w:b/>
-          <w:bCs/>
-        </w:rPr>
-        <w:t>fullstack</w:t>
-      </w:r>
-      <w:proofErr w:type="spellEnd"/>
-      <w:r>
-        <w:rPr>
-          <w:b/>
-          <w:bCs/>
-        </w:rPr>
-        <w:t>-</w:t>
-      </w:r>
-      <w:proofErr w:type="spellStart"/>
-      <w:r>
-        <w:rPr>
-          <w:b/>
-          <w:bCs/>
-        </w:rPr>
-        <w:t>llmops</w:t>
-      </w:r>
-      <w:proofErr w:type="spellEnd"/>
-      <w:r>
-        <w:rPr>
-          <w:b/>
-          <w:bCs/>
-        </w:rPr>
-        <w:t>-rag-chat-system</w:t>
+      <w:r>
+        <w:rPr>
+          <w:b/>
+          <w:bCs/>
+        </w:rPr>
+        <w:t>fullstack-llmops-rag-chat-system</w:t>
       </w:r>
     </w:p>
     <w:p>

</xml_diff>

<commit_message>
implement retriever module and vector store integration
</commit_message>
<xml_diff>
--- a/LLMOps_setup.docx
+++ b/LLMOps_setup.docx
@@ -26,49 +26,22 @@
           <w:b/>
           <w:bCs/>
         </w:rPr>
-        <w:t xml:space="preserve"> (Learn it - </w:t>
-      </w:r>
-      <w:r>
-        <w:rPr>
-          <w:b/>
-          <w:bCs/>
-        </w:rPr>
-        <w:t xml:space="preserve">what is </w:t>
-      </w:r>
-      <w:r>
-        <w:rPr>
-          <w:b/>
-          <w:bCs/>
-        </w:rPr>
-        <w:t>UV</w:t>
-      </w:r>
-      <w:r>
-        <w:rPr>
-          <w:b/>
-          <w:bCs/>
-        </w:rPr>
-        <w:t xml:space="preserve"> setup</w:t>
-      </w:r>
-      <w:r>
-        <w:rPr>
-          <w:b/>
-          <w:bCs/>
-        </w:rPr>
-        <w:t>?)</w:t>
-      </w:r>
-    </w:p>
-    <w:p>
-      <w:pPr>
-        <w:pStyle w:val="ListParagraph"/>
-        <w:rPr>
-          <w:b/>
-          <w:bCs/>
-        </w:rPr>
-      </w:pPr>
-      <w:r>
-        <w:rPr>
-          <w:b/>
-          <w:bCs/>
+        <w:t xml:space="preserve"> (Learn it - what is UV setup?)</w:t>
+      </w:r>
+    </w:p>
+    <w:p>
+      <w:pPr>
+        <w:pStyle w:val="ListParagraph"/>
+        <w:rPr>
+          <w:b/>
+          <w:bCs/>
+        </w:rPr>
+      </w:pPr>
+      <w:r>
+        <w:rPr>
+          <w:b/>
+          <w:bCs/>
+          <w:noProof/>
         </w:rPr>
         <w:drawing>
           <wp:inline distT="0" distB="0" distL="0" distR="0" wp14:anchorId="49CDEF36" wp14:editId="44FDE37E">
@@ -135,8 +108,13 @@
           <w:numId w:val="2"/>
         </w:numPr>
       </w:pPr>
-      <w:r>
-        <w:t>uv 0.10.0 (0ba432459 2026-02-05)</w:t>
+      <w:proofErr w:type="spellStart"/>
+      <w:r>
+        <w:t>uv</w:t>
+      </w:r>
+      <w:proofErr w:type="spellEnd"/>
+      <w:r>
+        <w:t xml:space="preserve"> 0.10.0 (0ba432459 2026-02-05)</w:t>
       </w:r>
       <w:r>
         <w:t xml:space="preserve"> this version installed in our project</w:t>
@@ -150,9 +128,24 @@
           <w:numId w:val="2"/>
         </w:numPr>
       </w:pPr>
-      <w:r>
-        <w:t>uv init .</w:t>
-      </w:r>
+      <w:proofErr w:type="spellStart"/>
+      <w:r>
+        <w:t>uv</w:t>
+      </w:r>
+      <w:proofErr w:type="spellEnd"/>
+      <w:r>
+        <w:t xml:space="preserve"> </w:t>
+      </w:r>
+      <w:proofErr w:type="spellStart"/>
+      <w:proofErr w:type="gramStart"/>
+      <w:r>
+        <w:t>init</w:t>
+      </w:r>
+      <w:proofErr w:type="spellEnd"/>
+      <w:r>
+        <w:t xml:space="preserve"> .</w:t>
+      </w:r>
+      <w:proofErr w:type="gramEnd"/>
       <w:r>
         <w:t xml:space="preserve"> (This command is used for python setup used in vs code)</w:t>
       </w:r>
@@ -165,9 +158,29 @@
           <w:numId w:val="2"/>
         </w:numPr>
       </w:pPr>
-      <w:r>
-        <w:t>uv venv .venv</w:t>
-      </w:r>
+      <w:proofErr w:type="spellStart"/>
+      <w:r>
+        <w:t>uv</w:t>
+      </w:r>
+      <w:proofErr w:type="spellEnd"/>
+      <w:r>
+        <w:t xml:space="preserve"> </w:t>
+      </w:r>
+      <w:proofErr w:type="spellStart"/>
+      <w:proofErr w:type="gramStart"/>
+      <w:r>
+        <w:t>venv</w:t>
+      </w:r>
+      <w:proofErr w:type="spellEnd"/>
+      <w:r>
+        <w:t xml:space="preserve"> .</w:t>
+      </w:r>
+      <w:proofErr w:type="spellStart"/>
+      <w:r>
+        <w:t>venv</w:t>
+      </w:r>
+      <w:proofErr w:type="spellEnd"/>
+      <w:proofErr w:type="gramEnd"/>
       <w:r>
         <w:t xml:space="preserve"> (This command for virtual environment)</w:t>
       </w:r>
@@ -180,44 +193,72 @@
           <w:numId w:val="2"/>
         </w:numPr>
       </w:pPr>
-      <w:r>
-        <w:t>uv add ipykernel</w:t>
-      </w:r>
-      <w:r>
-        <w:t xml:space="preserve"> (This is for jupyter notebook environment)</w:t>
-      </w:r>
-    </w:p>
-    <w:p>
-      <w:pPr>
-        <w:pStyle w:val="ListParagraph"/>
-        <w:numPr>
-          <w:ilvl w:val="0"/>
-          <w:numId w:val="2"/>
-        </w:numPr>
-      </w:pPr>
-      <w:r>
-        <w:t>uv sync (check on internet uses of this command)</w:t>
-      </w:r>
-    </w:p>
-    <w:p>
-      <w:pPr>
-        <w:pStyle w:val="ListParagraph"/>
-        <w:numPr>
-          <w:ilvl w:val="0"/>
-          <w:numId w:val="2"/>
-        </w:numPr>
-      </w:pPr>
-    </w:p>
-    <w:p>
-      <w:pPr>
-        <w:pStyle w:val="ListParagraph"/>
-        <w:numPr>
-          <w:ilvl w:val="0"/>
-          <w:numId w:val="2"/>
-        </w:numPr>
-      </w:pPr>
-      <w:r>
-        <w:t>LLMOps/</w:t>
+      <w:proofErr w:type="spellStart"/>
+      <w:r>
+        <w:t>uv</w:t>
+      </w:r>
+      <w:proofErr w:type="spellEnd"/>
+      <w:r>
+        <w:t xml:space="preserve"> add </w:t>
+      </w:r>
+      <w:proofErr w:type="spellStart"/>
+      <w:r>
+        <w:t>ipykernel</w:t>
+      </w:r>
+      <w:proofErr w:type="spellEnd"/>
+      <w:r>
+        <w:t xml:space="preserve"> (This is for </w:t>
+      </w:r>
+      <w:proofErr w:type="spellStart"/>
+      <w:r>
+        <w:t>jupyter</w:t>
+      </w:r>
+      <w:proofErr w:type="spellEnd"/>
+      <w:r>
+        <w:t xml:space="preserve"> notebook environment)</w:t>
+      </w:r>
+    </w:p>
+    <w:p>
+      <w:pPr>
+        <w:pStyle w:val="ListParagraph"/>
+        <w:numPr>
+          <w:ilvl w:val="0"/>
+          <w:numId w:val="2"/>
+        </w:numPr>
+      </w:pPr>
+      <w:proofErr w:type="spellStart"/>
+      <w:r>
+        <w:t>uv</w:t>
+      </w:r>
+      <w:proofErr w:type="spellEnd"/>
+      <w:r>
+        <w:t xml:space="preserve"> sync (check on internet uses of this command)</w:t>
+      </w:r>
+    </w:p>
+    <w:p>
+      <w:pPr>
+        <w:pStyle w:val="ListParagraph"/>
+        <w:numPr>
+          <w:ilvl w:val="0"/>
+          <w:numId w:val="2"/>
+        </w:numPr>
+      </w:pPr>
+    </w:p>
+    <w:p>
+      <w:pPr>
+        <w:pStyle w:val="ListParagraph"/>
+        <w:numPr>
+          <w:ilvl w:val="0"/>
+          <w:numId w:val="2"/>
+        </w:numPr>
+      </w:pPr>
+      <w:proofErr w:type="spellStart"/>
+      <w:r>
+        <w:t>LLMOps</w:t>
+      </w:r>
+      <w:proofErr w:type="spellEnd"/>
+      <w:r>
+        <w:t>/</w:t>
       </w:r>
     </w:p>
     <w:p>
@@ -253,16 +294,79 @@
         <w:t>──</w:t>
       </w:r>
       <w:r>
-        <w:t xml:space="preserve"> data/(This folder stores all the input documents that your AI system will read and learn from</w:t>
+        <w:t xml:space="preserve"> data</w:t>
+      </w:r>
+      <w:proofErr w:type="gramStart"/>
+      <w:r>
+        <w:t>/(</w:t>
+      </w:r>
+      <w:proofErr w:type="gramEnd"/>
+      <w:r>
+        <w:t>This folder stores all the input documents that your AI system will read and learn from</w:t>
       </w:r>
       <w:r>
         <w:t>.</w:t>
       </w:r>
       <w:r>
+        <w:t xml:space="preserve"> These can be text files, PDFs, Word documents, or any knowledge base files</w:t>
+      </w:r>
+      <w:r>
+        <w:t>)</w:t>
+      </w:r>
+    </w:p>
+    <w:p>
+      <w:pPr>
+        <w:pStyle w:val="ListParagraph"/>
+        <w:numPr>
+          <w:ilvl w:val="0"/>
+          <w:numId w:val="2"/>
+        </w:numPr>
+      </w:pPr>
+      <w:r>
+        <w:t>│</w:t>
+      </w:r>
+    </w:p>
+    <w:p>
+      <w:pPr>
+        <w:pStyle w:val="ListParagraph"/>
+        <w:numPr>
+          <w:ilvl w:val="0"/>
+          <w:numId w:val="2"/>
+        </w:numPr>
+      </w:pPr>
+      <w:r>
+        <w:rPr>
+          <w:rFonts w:ascii="MS Gothic" w:eastAsia="MS Gothic" w:hAnsi="MS Gothic" w:cs="MS Gothic" w:hint="eastAsia"/>
+        </w:rPr>
+        <w:t>├</w:t>
+      </w:r>
+      <w:r>
+        <w:rPr>
+          <w:rFonts w:ascii="Calibri" w:hAnsi="Calibri" w:cs="Calibri"/>
+        </w:rPr>
+        <w:t>──</w:t>
+      </w:r>
+      <w:r>
         <w:t xml:space="preserve"> </w:t>
       </w:r>
-      <w:r>
-        <w:t>These can be text files, PDFs, Word documents, or any knowledge base files</w:t>
+      <w:proofErr w:type="spellStart"/>
+      <w:r>
+        <w:t>multi_doc_chat</w:t>
+      </w:r>
+      <w:proofErr w:type="spellEnd"/>
+      <w:proofErr w:type="gramStart"/>
+      <w:r>
+        <w:t>/</w:t>
+      </w:r>
+      <w:r>
+        <w:t>(</w:t>
+      </w:r>
+      <w:r>
+        <w:t xml:space="preserve"> This</w:t>
+      </w:r>
+      <w:proofErr w:type="gramEnd"/>
+      <w:r>
+        <w:t xml:space="preserve"> is the main application folder where all AI logic and system modules are written. It contains all components required to build the RAG chatbot.</w:t>
       </w:r>
       <w:r>
         <w:t>)</w:t>
@@ -277,17 +381,8 @@
         </w:numPr>
       </w:pPr>
       <w:r>
-        <w:t>│</w:t>
-      </w:r>
-    </w:p>
-    <w:p>
-      <w:pPr>
-        <w:pStyle w:val="ListParagraph"/>
-        <w:numPr>
-          <w:ilvl w:val="0"/>
-          <w:numId w:val="2"/>
-        </w:numPr>
-      </w:pPr>
+        <w:t xml:space="preserve">│   </w:t>
+      </w:r>
       <w:r>
         <w:rPr>
           <w:rFonts w:ascii="MS Gothic" w:eastAsia="MS Gothic" w:hAnsi="MS Gothic" w:cs="MS Gothic" w:hint="eastAsia"/>
@@ -301,16 +396,61 @@
         <w:t>──</w:t>
       </w:r>
       <w:r>
-        <w:t xml:space="preserve"> multi_doc_chat/</w:t>
-      </w:r>
-      <w:r>
-        <w:t>(</w:t>
+        <w:t xml:space="preserve"> config/ (</w:t>
+      </w:r>
+      <w:r>
+        <w:t>Stores project settings like chunk size, model name, database paths, and environment configuration. It helps avoid hardcoding values inside code.</w:t>
+      </w:r>
+      <w:r>
+        <w:t>)</w:t>
+      </w:r>
+    </w:p>
+    <w:p>
+      <w:pPr>
+        <w:pStyle w:val="ListParagraph"/>
+        <w:numPr>
+          <w:ilvl w:val="0"/>
+          <w:numId w:val="2"/>
+        </w:numPr>
+      </w:pPr>
+      <w:r>
+        <w:t xml:space="preserve">│   </w:t>
+      </w:r>
+      <w:r>
+        <w:rPr>
+          <w:rFonts w:ascii="MS Gothic" w:eastAsia="MS Gothic" w:hAnsi="MS Gothic" w:cs="MS Gothic" w:hint="eastAsia"/>
+        </w:rPr>
+        <w:t>├</w:t>
+      </w:r>
+      <w:r>
+        <w:rPr>
+          <w:rFonts w:ascii="Calibri" w:hAnsi="Calibri" w:cs="Calibri"/>
+        </w:rPr>
+        <w:t>──</w:t>
+      </w:r>
+      <w:r>
+        <w:t xml:space="preserve"> exceptions</w:t>
+      </w:r>
+      <w:proofErr w:type="gramStart"/>
+      <w:r>
+        <w:t>/(</w:t>
+      </w:r>
+      <w:proofErr w:type="gramEnd"/>
+      <w:r>
+        <w:t xml:space="preserve">Handles </w:t>
+      </w:r>
+      <w:r>
+        <w:rPr>
+          <w:b/>
+          <w:bCs/>
+        </w:rPr>
+        <w:t>errors safely and professionally</w:t>
       </w:r>
       <w:r>
         <w:t xml:space="preserve"> </w:t>
       </w:r>
       <w:r>
-        <w:t>This is the main application folder where all AI logic and system modules are written. It contains all components required to build the RAG chatbot.</w:t>
+        <w:t>and makes debugging easier.</w:t>
       </w:r>
       <w:r>
         <w:t>)</w:t>
@@ -340,10 +480,18 @@
         <w:t>──</w:t>
       </w:r>
       <w:r>
-        <w:t xml:space="preserve"> config/ (</w:t>
-      </w:r>
-      <w:r>
-        <w:t>Stores project settings like chunk size, model name, database paths, and environment configuration. It helps avoid hardcoding values inside code.</w:t>
+        <w:t xml:space="preserve"> logger</w:t>
+      </w:r>
+      <w:proofErr w:type="gramStart"/>
+      <w:r>
+        <w:t>/(</w:t>
+      </w:r>
+      <w:r>
+        <w:t xml:space="preserve"> Records</w:t>
+      </w:r>
+      <w:proofErr w:type="gramEnd"/>
+      <w:r>
+        <w:t xml:space="preserve"> system activities like loading documents, model calls, failures, and debugging logs. This helps track system performance and errors.</w:t>
       </w:r>
       <w:r>
         <w:t>)</w:t>
@@ -373,23 +521,161 @@
         <w:t>──</w:t>
       </w:r>
       <w:r>
-        <w:t xml:space="preserve"> exceptions/(</w:t>
-      </w:r>
-      <w:r>
-        <w:t xml:space="preserve">Handles </w:t>
-      </w:r>
-      <w:r>
-        <w:rPr>
-          <w:b/>
-          <w:bCs/>
-        </w:rPr>
-        <w:t>errors safely and professionally</w:t>
+        <w:t xml:space="preserve"> loaders</w:t>
+      </w:r>
+      <w:proofErr w:type="gramStart"/>
+      <w:r>
+        <w:t>/(</w:t>
+      </w:r>
+      <w:r>
+        <w:t xml:space="preserve"> Loads</w:t>
+      </w:r>
+      <w:proofErr w:type="gramEnd"/>
+      <w:r>
+        <w:t xml:space="preserve"> documents from different sources like TXT, PDF, or directories and converts them into </w:t>
+      </w:r>
+      <w:proofErr w:type="spellStart"/>
+      <w:r>
+        <w:t>LangChain</w:t>
+      </w:r>
+      <w:proofErr w:type="spellEnd"/>
+      <w:r>
+        <w:t xml:space="preserve"> document format.</w:t>
+      </w:r>
+      <w:r>
+        <w:t>)</w:t>
+      </w:r>
+    </w:p>
+    <w:p>
+      <w:pPr>
+        <w:pStyle w:val="ListParagraph"/>
+        <w:numPr>
+          <w:ilvl w:val="0"/>
+          <w:numId w:val="2"/>
+        </w:numPr>
+      </w:pPr>
+      <w:r>
+        <w:t xml:space="preserve">│   </w:t>
+      </w:r>
+      <w:r>
+        <w:rPr>
+          <w:rFonts w:ascii="MS Gothic" w:eastAsia="MS Gothic" w:hAnsi="MS Gothic" w:cs="MS Gothic" w:hint="eastAsia"/>
+        </w:rPr>
+        <w:t>├</w:t>
+      </w:r>
+      <w:r>
+        <w:rPr>
+          <w:rFonts w:ascii="Calibri" w:hAnsi="Calibri" w:cs="Calibri"/>
+        </w:rPr>
+        <w:t>──</w:t>
+      </w:r>
+      <w:r>
+        <w:t xml:space="preserve"> splitter</w:t>
+      </w:r>
+      <w:proofErr w:type="gramStart"/>
+      <w:r>
+        <w:t>/(</w:t>
+      </w:r>
+      <w:r>
+        <w:t xml:space="preserve"> Breaks</w:t>
+      </w:r>
+      <w:proofErr w:type="gramEnd"/>
+      <w:r>
+        <w:t xml:space="preserve"> large documents into smaller chunks so that embeddings and retrieval work efficiently.</w:t>
+      </w:r>
+      <w:r>
+        <w:t>)</w:t>
+      </w:r>
+    </w:p>
+    <w:p>
+      <w:pPr>
+        <w:pStyle w:val="ListParagraph"/>
+        <w:numPr>
+          <w:ilvl w:val="0"/>
+          <w:numId w:val="2"/>
+        </w:numPr>
+      </w:pPr>
+      <w:r>
+        <w:t xml:space="preserve">│   </w:t>
+      </w:r>
+      <w:r>
+        <w:rPr>
+          <w:rFonts w:ascii="MS Gothic" w:eastAsia="MS Gothic" w:hAnsi="MS Gothic" w:cs="MS Gothic" w:hint="eastAsia"/>
+        </w:rPr>
+        <w:t>├</w:t>
+      </w:r>
+      <w:r>
+        <w:rPr>
+          <w:rFonts w:ascii="Calibri" w:hAnsi="Calibri" w:cs="Calibri"/>
+        </w:rPr>
+        <w:t>──</w:t>
+      </w:r>
+      <w:r>
+        <w:t xml:space="preserve"> embeddings</w:t>
+      </w:r>
+      <w:proofErr w:type="gramStart"/>
+      <w:r>
+        <w:t>/(</w:t>
+      </w:r>
+      <w:proofErr w:type="gramEnd"/>
+      <w:r>
+        <w:t>Converts text chunks into numerical vectors that AI models can understand and compare.</w:t>
+      </w:r>
+      <w:r>
+        <w:t>)</w:t>
+      </w:r>
+    </w:p>
+    <w:p>
+      <w:pPr>
+        <w:pStyle w:val="ListParagraph"/>
+        <w:numPr>
+          <w:ilvl w:val="0"/>
+          <w:numId w:val="2"/>
+        </w:numPr>
+      </w:pPr>
+      <w:r>
+        <w:t xml:space="preserve">│   </w:t>
+      </w:r>
+      <w:r>
+        <w:rPr>
+          <w:rFonts w:ascii="MS Gothic" w:eastAsia="MS Gothic" w:hAnsi="MS Gothic" w:cs="MS Gothic" w:hint="eastAsia"/>
+        </w:rPr>
+        <w:t>├</w:t>
+      </w:r>
+      <w:r>
+        <w:rPr>
+          <w:rFonts w:ascii="Calibri" w:hAnsi="Calibri" w:cs="Calibri"/>
+        </w:rPr>
+        <w:t>──</w:t>
       </w:r>
       <w:r>
         <w:t xml:space="preserve"> </w:t>
       </w:r>
-      <w:r>
-        <w:t>and makes debugging easier.</w:t>
+      <w:proofErr w:type="spellStart"/>
+      <w:r>
+        <w:t>vectorstore</w:t>
+      </w:r>
+      <w:proofErr w:type="spellEnd"/>
+      <w:proofErr w:type="gramStart"/>
+      <w:r>
+        <w:t>/(</w:t>
+      </w:r>
+      <w:proofErr w:type="gramEnd"/>
+      <w:r>
+        <w:t>Stores embeddings into vector databases like FAISS or Chroma and allows fast similarity search.</w:t>
+      </w:r>
+      <w:r>
+        <w:t xml:space="preserve"> Means </w:t>
+      </w:r>
+      <w:r>
+        <w:t xml:space="preserve">Stores AI knowledge in </w:t>
+      </w:r>
+      <w:r>
+        <w:rPr>
+          <w:b/>
+          <w:bCs/>
+        </w:rPr>
+        <w:t>searchable format</w:t>
       </w:r>
       <w:r>
         <w:t>)</w:t>
@@ -419,200 +705,18 @@
         <w:t>──</w:t>
       </w:r>
       <w:r>
-        <w:t xml:space="preserve"> logger/(</w:t>
-      </w:r>
-      <w:r>
-        <w:t xml:space="preserve"> </w:t>
-      </w:r>
-      <w:r>
-        <w:t>Records system activities like loading documents, model calls, failures, and debugging logs. This helps track system performance and errors.</w:t>
-      </w:r>
-      <w:r>
-        <w:t>)</w:t>
-      </w:r>
-    </w:p>
-    <w:p>
-      <w:pPr>
-        <w:pStyle w:val="ListParagraph"/>
-        <w:numPr>
-          <w:ilvl w:val="0"/>
-          <w:numId w:val="2"/>
-        </w:numPr>
-      </w:pPr>
-      <w:r>
-        <w:t xml:space="preserve">│   </w:t>
-      </w:r>
-      <w:r>
-        <w:rPr>
-          <w:rFonts w:ascii="MS Gothic" w:eastAsia="MS Gothic" w:hAnsi="MS Gothic" w:cs="MS Gothic" w:hint="eastAsia"/>
-        </w:rPr>
-        <w:t>├</w:t>
-      </w:r>
-      <w:r>
-        <w:rPr>
-          <w:rFonts w:ascii="Calibri" w:hAnsi="Calibri" w:cs="Calibri"/>
-        </w:rPr>
-        <w:t>──</w:t>
-      </w:r>
-      <w:r>
-        <w:t xml:space="preserve"> loaders/(</w:t>
-      </w:r>
-      <w:r>
-        <w:t xml:space="preserve"> </w:t>
-      </w:r>
-      <w:r>
-        <w:t>Loads documents from different sources like TXT, PDF, or directories and converts them into LangChain document format.</w:t>
-      </w:r>
-      <w:r>
-        <w:t>)</w:t>
-      </w:r>
-    </w:p>
-    <w:p>
-      <w:pPr>
-        <w:pStyle w:val="ListParagraph"/>
-        <w:numPr>
-          <w:ilvl w:val="0"/>
-          <w:numId w:val="2"/>
-        </w:numPr>
-      </w:pPr>
-      <w:r>
-        <w:t xml:space="preserve">│   </w:t>
-      </w:r>
-      <w:r>
-        <w:rPr>
-          <w:rFonts w:ascii="MS Gothic" w:eastAsia="MS Gothic" w:hAnsi="MS Gothic" w:cs="MS Gothic" w:hint="eastAsia"/>
-        </w:rPr>
-        <w:t>├</w:t>
-      </w:r>
-      <w:r>
-        <w:rPr>
-          <w:rFonts w:ascii="Calibri" w:hAnsi="Calibri" w:cs="Calibri"/>
-        </w:rPr>
-        <w:t>──</w:t>
-      </w:r>
-      <w:r>
-        <w:t xml:space="preserve"> splitter/(</w:t>
-      </w:r>
-      <w:r>
-        <w:t xml:space="preserve"> </w:t>
-      </w:r>
-      <w:r>
-        <w:t>Breaks large documents into smaller chunks so that embeddings and retrieval work efficiently.</w:t>
-      </w:r>
-      <w:r>
-        <w:t>)</w:t>
-      </w:r>
-    </w:p>
-    <w:p>
-      <w:pPr>
-        <w:pStyle w:val="ListParagraph"/>
-        <w:numPr>
-          <w:ilvl w:val="0"/>
-          <w:numId w:val="2"/>
-        </w:numPr>
-      </w:pPr>
-      <w:r>
-        <w:t xml:space="preserve">│   </w:t>
-      </w:r>
-      <w:r>
-        <w:rPr>
-          <w:rFonts w:ascii="MS Gothic" w:eastAsia="MS Gothic" w:hAnsi="MS Gothic" w:cs="MS Gothic" w:hint="eastAsia"/>
-        </w:rPr>
-        <w:t>├</w:t>
-      </w:r>
-      <w:r>
-        <w:rPr>
-          <w:rFonts w:ascii="Calibri" w:hAnsi="Calibri" w:cs="Calibri"/>
-        </w:rPr>
-        <w:t>──</w:t>
-      </w:r>
-      <w:r>
-        <w:t xml:space="preserve"> embeddings/(</w:t>
-      </w:r>
-      <w:r>
-        <w:t>Converts text chunks into numerical vectors that AI models can understand and compare.</w:t>
-      </w:r>
-      <w:r>
-        <w:t>)</w:t>
-      </w:r>
-    </w:p>
-    <w:p>
-      <w:pPr>
-        <w:pStyle w:val="ListParagraph"/>
-        <w:numPr>
-          <w:ilvl w:val="0"/>
-          <w:numId w:val="2"/>
-        </w:numPr>
-      </w:pPr>
-      <w:r>
-        <w:t xml:space="preserve">│   </w:t>
-      </w:r>
-      <w:r>
-        <w:rPr>
-          <w:rFonts w:ascii="MS Gothic" w:eastAsia="MS Gothic" w:hAnsi="MS Gothic" w:cs="MS Gothic" w:hint="eastAsia"/>
-        </w:rPr>
-        <w:t>├</w:t>
-      </w:r>
-      <w:r>
-        <w:rPr>
-          <w:rFonts w:ascii="Calibri" w:hAnsi="Calibri" w:cs="Calibri"/>
-        </w:rPr>
-        <w:t>──</w:t>
-      </w:r>
-      <w:r>
-        <w:t xml:space="preserve"> vectorstore/(</w:t>
-      </w:r>
-      <w:r>
-        <w:t>Stores embeddings into vector databases like FAISS or Chroma and allows fast similarity search.</w:t>
-      </w:r>
-      <w:r>
-        <w:t xml:space="preserve"> Means </w:t>
-      </w:r>
-      <w:r>
-        <w:t xml:space="preserve">Stores AI knowledge in </w:t>
-      </w:r>
-      <w:r>
-        <w:rPr>
-          <w:b/>
-          <w:bCs/>
-        </w:rPr>
-        <w:t>searchable format</w:t>
-      </w:r>
-      <w:r>
-        <w:t>)</w:t>
-      </w:r>
-    </w:p>
-    <w:p>
-      <w:pPr>
-        <w:pStyle w:val="ListParagraph"/>
-        <w:numPr>
-          <w:ilvl w:val="0"/>
-          <w:numId w:val="2"/>
-        </w:numPr>
-      </w:pPr>
-      <w:r>
-        <w:t xml:space="preserve">│   </w:t>
-      </w:r>
-      <w:r>
-        <w:rPr>
-          <w:rFonts w:ascii="MS Gothic" w:eastAsia="MS Gothic" w:hAnsi="MS Gothic" w:cs="MS Gothic" w:hint="eastAsia"/>
-        </w:rPr>
-        <w:t>├</w:t>
-      </w:r>
-      <w:r>
-        <w:rPr>
-          <w:rFonts w:ascii="Calibri" w:hAnsi="Calibri" w:cs="Calibri"/>
-        </w:rPr>
-        <w:t>──</w:t>
-      </w:r>
-      <w:r>
-        <w:t xml:space="preserve"> retriever/(</w:t>
-      </w:r>
-      <w:r>
-        <w:t xml:space="preserve"> </w:t>
-      </w:r>
-      <w:r>
-        <w:t>Searches vector database and finds relevant document chunks based on user question.</w:t>
+        <w:t xml:space="preserve"> retriever</w:t>
+      </w:r>
+      <w:proofErr w:type="gramStart"/>
+      <w:r>
+        <w:t>/(</w:t>
+      </w:r>
+      <w:r>
+        <w:t xml:space="preserve"> Searches</w:t>
+      </w:r>
+      <w:proofErr w:type="gramEnd"/>
+      <w:r>
+        <w:t xml:space="preserve"> vector database and finds relevant document chunks based on user question.</w:t>
       </w:r>
       <w:r>
         <w:t>)</w:t>
@@ -643,13 +747,31 @@
         <w:t>──</w:t>
       </w:r>
       <w:r>
-        <w:t xml:space="preserve"> llm/(</w:t>
-      </w:r>
-      <w:r>
         <w:t xml:space="preserve"> </w:t>
       </w:r>
-      <w:r>
-        <w:t>Contains Large Language Model logic such as OpenAI, Ollama, or other LLM integrations used to generate final answers.</w:t>
+      <w:proofErr w:type="spellStart"/>
+      <w:r>
+        <w:t>llm</w:t>
+      </w:r>
+      <w:proofErr w:type="spellEnd"/>
+      <w:proofErr w:type="gramStart"/>
+      <w:r>
+        <w:t>/(</w:t>
+      </w:r>
+      <w:r>
+        <w:t xml:space="preserve"> Contains</w:t>
+      </w:r>
+      <w:proofErr w:type="gramEnd"/>
+      <w:r>
+        <w:t xml:space="preserve"> Large Language Model logic such as OpenAI, </w:t>
+      </w:r>
+      <w:proofErr w:type="spellStart"/>
+      <w:r>
+        <w:t>Ollama</w:t>
+      </w:r>
+      <w:proofErr w:type="spellEnd"/>
+      <w:r>
+        <w:t>, or other LLM integrations used to generate final answers.</w:t>
       </w:r>
       <w:r>
         <w:t>)</w:t>
@@ -679,168 +801,199 @@
         <w:t>──</w:t>
       </w:r>
       <w:r>
-        <w:t xml:space="preserve"> pipeline/(</w:t>
+        <w:t xml:space="preserve"> pipeline</w:t>
+      </w:r>
+      <w:proofErr w:type="gramStart"/>
+      <w:r>
+        <w:t>/(</w:t>
+      </w:r>
+      <w:r>
+        <w:t xml:space="preserve"> Combines</w:t>
+      </w:r>
+      <w:proofErr w:type="gramEnd"/>
+      <w:r>
+        <w:t xml:space="preserve"> loader → splitter → embedding → retriever → LLM into one full RAG workflow.</w:t>
+      </w:r>
+      <w:r>
+        <w:t xml:space="preserve"> Means </w:t>
+      </w:r>
+      <w:r>
+        <w:t xml:space="preserve">Controls </w:t>
+      </w:r>
+      <w:r>
+        <w:rPr>
+          <w:b/>
+          <w:bCs/>
+        </w:rPr>
+        <w:t>complete AI processing flow</w:t>
+      </w:r>
+      <w:r>
+        <w:t>.</w:t>
+      </w:r>
+      <w:r>
+        <w:t>)</w:t>
+      </w:r>
+    </w:p>
+    <w:p>
+      <w:pPr>
+        <w:pStyle w:val="ListParagraph"/>
+        <w:numPr>
+          <w:ilvl w:val="0"/>
+          <w:numId w:val="2"/>
+        </w:numPr>
+      </w:pPr>
+      <w:r>
+        <w:t xml:space="preserve">│   </w:t>
+      </w:r>
+      <w:r>
+        <w:rPr>
+          <w:rFonts w:ascii="MS Gothic" w:eastAsia="MS Gothic" w:hAnsi="MS Gothic" w:cs="MS Gothic" w:hint="eastAsia"/>
+        </w:rPr>
+        <w:t>├</w:t>
+      </w:r>
+      <w:r>
+        <w:rPr>
+          <w:rFonts w:ascii="Calibri" w:hAnsi="Calibri" w:cs="Calibri"/>
+        </w:rPr>
+        <w:t>──</w:t>
+      </w:r>
+      <w:r>
+        <w:t xml:space="preserve"> utils</w:t>
+      </w:r>
+      <w:proofErr w:type="gramStart"/>
+      <w:r>
+        <w:t>/(</w:t>
+      </w:r>
+      <w:r>
+        <w:t xml:space="preserve"> Stores</w:t>
+      </w:r>
+      <w:proofErr w:type="gramEnd"/>
+      <w:r>
+        <w:t xml:space="preserve"> helper functions like file handling, text cleaning, validation, or reusable small functions.</w:t>
+      </w:r>
+      <w:r>
+        <w:t>)</w:t>
+      </w:r>
+    </w:p>
+    <w:p>
+      <w:pPr>
+        <w:pStyle w:val="ListParagraph"/>
+        <w:numPr>
+          <w:ilvl w:val="0"/>
+          <w:numId w:val="2"/>
+        </w:numPr>
+      </w:pPr>
+      <w:r>
+        <w:t>│</w:t>
+      </w:r>
+    </w:p>
+    <w:p>
+      <w:pPr>
+        <w:pStyle w:val="ListParagraph"/>
+        <w:numPr>
+          <w:ilvl w:val="0"/>
+          <w:numId w:val="2"/>
+        </w:numPr>
+      </w:pPr>
+      <w:r>
+        <w:rPr>
+          <w:rFonts w:ascii="MS Gothic" w:eastAsia="MS Gothic" w:hAnsi="MS Gothic" w:cs="MS Gothic" w:hint="eastAsia"/>
+        </w:rPr>
+        <w:t>├</w:t>
+      </w:r>
+      <w:r>
+        <w:rPr>
+          <w:rFonts w:ascii="Calibri" w:hAnsi="Calibri" w:cs="Calibri"/>
+        </w:rPr>
+        <w:t>──</w:t>
+      </w:r>
+      <w:r>
+        <w:t xml:space="preserve"> notebook</w:t>
+      </w:r>
+      <w:proofErr w:type="gramStart"/>
+      <w:r>
+        <w:t>/(</w:t>
+      </w:r>
+      <w:r>
+        <w:t xml:space="preserve"> Used</w:t>
+      </w:r>
+      <w:proofErr w:type="gramEnd"/>
+      <w:r>
+        <w:t xml:space="preserve"> for experimentation, testing, and research before implementing code into production modules.</w:t>
+      </w:r>
+      <w:r>
+        <w:t>)</w:t>
+      </w:r>
+    </w:p>
+    <w:p>
+      <w:pPr>
+        <w:pStyle w:val="ListParagraph"/>
+        <w:numPr>
+          <w:ilvl w:val="0"/>
+          <w:numId w:val="2"/>
+        </w:numPr>
+      </w:pPr>
+      <w:r>
+        <w:rPr>
+          <w:rFonts w:ascii="MS Gothic" w:eastAsia="MS Gothic" w:hAnsi="MS Gothic" w:cs="MS Gothic" w:hint="eastAsia"/>
+        </w:rPr>
+        <w:t>├</w:t>
+      </w:r>
+      <w:r>
+        <w:rPr>
+          <w:rFonts w:ascii="Calibri" w:hAnsi="Calibri" w:cs="Calibri"/>
+        </w:rPr>
+        <w:t>─</w:t>
+      </w:r>
+      <w:proofErr w:type="gramStart"/>
+      <w:r>
+        <w:rPr>
+          <w:rFonts w:ascii="Calibri" w:hAnsi="Calibri" w:cs="Calibri"/>
+        </w:rPr>
+        <w:t>─</w:t>
+      </w:r>
+      <w:r>
+        <w:t xml:space="preserve"> .env</w:t>
+      </w:r>
+      <w:proofErr w:type="gramEnd"/>
+      <w:r>
+        <w:t>(</w:t>
+      </w:r>
+      <w:r>
+        <w:t>Stores secret keys like API keys, tokens, and environment variables securely.</w:t>
+      </w:r>
+      <w:r>
+        <w:t>)</w:t>
+      </w:r>
+    </w:p>
+    <w:p>
+      <w:pPr>
+        <w:pStyle w:val="ListParagraph"/>
+        <w:numPr>
+          <w:ilvl w:val="0"/>
+          <w:numId w:val="2"/>
+        </w:numPr>
+      </w:pPr>
+      <w:r>
+        <w:rPr>
+          <w:rFonts w:ascii="MS Gothic" w:eastAsia="MS Gothic" w:hAnsi="MS Gothic" w:cs="MS Gothic" w:hint="eastAsia"/>
+        </w:rPr>
+        <w:t>├</w:t>
+      </w:r>
+      <w:r>
+        <w:rPr>
+          <w:rFonts w:ascii="Calibri" w:hAnsi="Calibri" w:cs="Calibri"/>
+        </w:rPr>
+        <w:t>──</w:t>
       </w:r>
       <w:r>
         <w:t xml:space="preserve"> </w:t>
       </w:r>
-      <w:r>
-        <w:t>Combines loader → splitter → embedding → retriever → LLM into one full RAG workflow.</w:t>
-      </w:r>
-      <w:r>
-        <w:t xml:space="preserve"> Means </w:t>
-      </w:r>
-      <w:r>
-        <w:t xml:space="preserve">Controls </w:t>
-      </w:r>
-      <w:r>
-        <w:rPr>
-          <w:b/>
-          <w:bCs/>
-        </w:rPr>
-        <w:t>complete AI processing flow</w:t>
-      </w:r>
-      <w:r>
-        <w:t>.</w:t>
-      </w:r>
-      <w:r>
-        <w:t>)</w:t>
-      </w:r>
-    </w:p>
-    <w:p>
-      <w:pPr>
-        <w:pStyle w:val="ListParagraph"/>
-        <w:numPr>
-          <w:ilvl w:val="0"/>
-          <w:numId w:val="2"/>
-        </w:numPr>
-      </w:pPr>
-      <w:r>
-        <w:t xml:space="preserve">│   </w:t>
-      </w:r>
-      <w:r>
-        <w:rPr>
-          <w:rFonts w:ascii="MS Gothic" w:eastAsia="MS Gothic" w:hAnsi="MS Gothic" w:cs="MS Gothic" w:hint="eastAsia"/>
-        </w:rPr>
-        <w:t>├</w:t>
-      </w:r>
-      <w:r>
-        <w:rPr>
-          <w:rFonts w:ascii="Calibri" w:hAnsi="Calibri" w:cs="Calibri"/>
-        </w:rPr>
-        <w:t>──</w:t>
-      </w:r>
-      <w:r>
-        <w:t xml:space="preserve"> utils/(</w:t>
-      </w:r>
-      <w:r>
-        <w:t xml:space="preserve"> </w:t>
-      </w:r>
-      <w:r>
-        <w:t>Stores helper functions like file handling, text cleaning, validation, or reusable small functions.</w:t>
-      </w:r>
-      <w:r>
-        <w:t>)</w:t>
-      </w:r>
-    </w:p>
-    <w:p>
-      <w:pPr>
-        <w:pStyle w:val="ListParagraph"/>
-        <w:numPr>
-          <w:ilvl w:val="0"/>
-          <w:numId w:val="2"/>
-        </w:numPr>
-      </w:pPr>
-      <w:r>
-        <w:t>│</w:t>
-      </w:r>
-    </w:p>
-    <w:p>
-      <w:pPr>
-        <w:pStyle w:val="ListParagraph"/>
-        <w:numPr>
-          <w:ilvl w:val="0"/>
-          <w:numId w:val="2"/>
-        </w:numPr>
-      </w:pPr>
-      <w:r>
-        <w:rPr>
-          <w:rFonts w:ascii="MS Gothic" w:eastAsia="MS Gothic" w:hAnsi="MS Gothic" w:cs="MS Gothic" w:hint="eastAsia"/>
-        </w:rPr>
-        <w:t>├</w:t>
-      </w:r>
-      <w:r>
-        <w:rPr>
-          <w:rFonts w:ascii="Calibri" w:hAnsi="Calibri" w:cs="Calibri"/>
-        </w:rPr>
-        <w:t>──</w:t>
-      </w:r>
-      <w:r>
-        <w:t xml:space="preserve"> notebook/(</w:t>
-      </w:r>
-      <w:r>
-        <w:t xml:space="preserve"> </w:t>
-      </w:r>
-      <w:r>
-        <w:t>Used for experimentation, testing, and research before implementing code into production modules.</w:t>
-      </w:r>
-      <w:r>
-        <w:t>)</w:t>
-      </w:r>
-    </w:p>
-    <w:p>
-      <w:pPr>
-        <w:pStyle w:val="ListParagraph"/>
-        <w:numPr>
-          <w:ilvl w:val="0"/>
-          <w:numId w:val="2"/>
-        </w:numPr>
-      </w:pPr>
-      <w:r>
-        <w:rPr>
-          <w:rFonts w:ascii="MS Gothic" w:eastAsia="MS Gothic" w:hAnsi="MS Gothic" w:cs="MS Gothic" w:hint="eastAsia"/>
-        </w:rPr>
-        <w:t>├</w:t>
-      </w:r>
-      <w:r>
-        <w:rPr>
-          <w:rFonts w:ascii="Calibri" w:hAnsi="Calibri" w:cs="Calibri"/>
-        </w:rPr>
-        <w:t>──</w:t>
-      </w:r>
-      <w:r>
-        <w:t xml:space="preserve"> .env(</w:t>
-      </w:r>
-      <w:r>
-        <w:t>Stores secret keys like API keys, tokens, and environment variables securely.</w:t>
-      </w:r>
-      <w:r>
-        <w:t>)</w:t>
-      </w:r>
-    </w:p>
-    <w:p>
-      <w:pPr>
-        <w:pStyle w:val="ListParagraph"/>
-        <w:numPr>
-          <w:ilvl w:val="0"/>
-          <w:numId w:val="2"/>
-        </w:numPr>
-      </w:pPr>
-      <w:r>
-        <w:rPr>
-          <w:rFonts w:ascii="MS Gothic" w:eastAsia="MS Gothic" w:hAnsi="MS Gothic" w:cs="MS Gothic" w:hint="eastAsia"/>
-        </w:rPr>
-        <w:t>├</w:t>
-      </w:r>
-      <w:r>
-        <w:rPr>
-          <w:rFonts w:ascii="Calibri" w:hAnsi="Calibri" w:cs="Calibri"/>
-        </w:rPr>
-        <w:t>──</w:t>
-      </w:r>
-      <w:r>
-        <w:t xml:space="preserve"> main.py(</w:t>
-      </w:r>
+      <w:proofErr w:type="gramStart"/>
+      <w:r>
+        <w:t>main.py(</w:t>
+      </w:r>
+      <w:proofErr w:type="gramEnd"/>
       <w:r>
         <w:t>Acts as the main entry point of the application. It runs the pipeline and connects all modules together.</w:t>
       </w:r>
@@ -854,7 +1007,15 @@
         <w:ind w:firstLine="720"/>
       </w:pPr>
       <w:r>
-        <w:t>Real LLMOps systems follow separation of concerns:</w:t>
+        <w:t xml:space="preserve">Real </w:t>
+      </w:r>
+      <w:proofErr w:type="spellStart"/>
+      <w:r>
+        <w:t>LLMOps</w:t>
+      </w:r>
+      <w:proofErr w:type="spellEnd"/>
+      <w:r>
+        <w:t xml:space="preserve"> systems follow separation of concerns:</w:t>
       </w:r>
     </w:p>
     <w:p>
@@ -878,6 +1039,9 @@
         <w:ind w:firstLine="720"/>
       </w:pPr>
       <w:r>
+        <w:rPr>
+          <w:noProof/>
+        </w:rPr>
         <w:drawing>
           <wp:inline distT="0" distB="0" distL="0" distR="0" wp14:anchorId="2256B2BB" wp14:editId="2E536DC8">
             <wp:extent cx="6858000" cy="1892300"/>
@@ -934,6 +1098,8 @@
         </w:rPr>
         <w:t xml:space="preserve">Q. What is diff b/w </w:t>
       </w:r>
+      <w:proofErr w:type="spellStart"/>
+      <w:proofErr w:type="gramStart"/>
       <w:r>
         <w:rPr>
           <w:b/>
@@ -941,12 +1107,32 @@
         </w:rPr>
         <w:t>pyproject.toml</w:t>
       </w:r>
-      <w:r>
-        <w:rPr>
-          <w:b/>
-          <w:bCs/>
-        </w:rPr>
-        <w:t xml:space="preserve"> and uv.lock?</w:t>
+      <w:proofErr w:type="spellEnd"/>
+      <w:proofErr w:type="gramEnd"/>
+      <w:r>
+        <w:rPr>
+          <w:b/>
+          <w:bCs/>
+        </w:rPr>
+        <w:t xml:space="preserve"> and </w:t>
+      </w:r>
+      <w:proofErr w:type="spellStart"/>
+      <w:proofErr w:type="gramStart"/>
+      <w:r>
+        <w:rPr>
+          <w:b/>
+          <w:bCs/>
+        </w:rPr>
+        <w:t>uv.lock</w:t>
+      </w:r>
+      <w:proofErr w:type="spellEnd"/>
+      <w:proofErr w:type="gramEnd"/>
+      <w:r>
+        <w:rPr>
+          <w:b/>
+          <w:bCs/>
+        </w:rPr>
+        <w:t>?</w:t>
       </w:r>
     </w:p>
     <w:p>
@@ -988,7 +1174,115 @@
           <w:szCs w:val="21"/>
           <w14:ligatures w14:val="none"/>
         </w:rPr>
-        <w:t>! uv pip install langchain openai tiktoken rapidocr</w:t>
+        <w:t xml:space="preserve">! </w:t>
+      </w:r>
+      <w:proofErr w:type="spellStart"/>
+      <w:r>
+        <w:rPr>
+          <w:rFonts w:ascii="Consolas" w:eastAsia="Times New Roman" w:hAnsi="Consolas" w:cs="Times New Roman"/>
+          <w:color w:val="CCCCCC"/>
+          <w:kern w:val="0"/>
+          <w:sz w:val="21"/>
+          <w:szCs w:val="21"/>
+          <w14:ligatures w14:val="none"/>
+        </w:rPr>
+        <w:t>uv</w:t>
+      </w:r>
+      <w:proofErr w:type="spellEnd"/>
+      <w:r>
+        <w:rPr>
+          <w:rFonts w:ascii="Consolas" w:eastAsia="Times New Roman" w:hAnsi="Consolas" w:cs="Times New Roman"/>
+          <w:color w:val="CCCCCC"/>
+          <w:kern w:val="0"/>
+          <w:sz w:val="21"/>
+          <w:szCs w:val="21"/>
+          <w14:ligatures w14:val="none"/>
+        </w:rPr>
+        <w:t xml:space="preserve"> pip install </w:t>
+      </w:r>
+      <w:proofErr w:type="spellStart"/>
+      <w:r>
+        <w:rPr>
+          <w:rFonts w:ascii="Consolas" w:eastAsia="Times New Roman" w:hAnsi="Consolas" w:cs="Times New Roman"/>
+          <w:color w:val="CCCCCC"/>
+          <w:kern w:val="0"/>
+          <w:sz w:val="21"/>
+          <w:szCs w:val="21"/>
+          <w14:ligatures w14:val="none"/>
+        </w:rPr>
+        <w:t>langchain</w:t>
+      </w:r>
+      <w:proofErr w:type="spellEnd"/>
+      <w:r>
+        <w:rPr>
+          <w:rFonts w:ascii="Consolas" w:eastAsia="Times New Roman" w:hAnsi="Consolas" w:cs="Times New Roman"/>
+          <w:color w:val="CCCCCC"/>
+          <w:kern w:val="0"/>
+          <w:sz w:val="21"/>
+          <w:szCs w:val="21"/>
+          <w14:ligatures w14:val="none"/>
+        </w:rPr>
+        <w:t xml:space="preserve"> </w:t>
+      </w:r>
+      <w:proofErr w:type="spellStart"/>
+      <w:r>
+        <w:rPr>
+          <w:rFonts w:ascii="Consolas" w:eastAsia="Times New Roman" w:hAnsi="Consolas" w:cs="Times New Roman"/>
+          <w:color w:val="CCCCCC"/>
+          <w:kern w:val="0"/>
+          <w:sz w:val="21"/>
+          <w:szCs w:val="21"/>
+          <w14:ligatures w14:val="none"/>
+        </w:rPr>
+        <w:t>openai</w:t>
+      </w:r>
+      <w:proofErr w:type="spellEnd"/>
+      <w:r>
+        <w:rPr>
+          <w:rFonts w:ascii="Consolas" w:eastAsia="Times New Roman" w:hAnsi="Consolas" w:cs="Times New Roman"/>
+          <w:color w:val="CCCCCC"/>
+          <w:kern w:val="0"/>
+          <w:sz w:val="21"/>
+          <w:szCs w:val="21"/>
+          <w14:ligatures w14:val="none"/>
+        </w:rPr>
+        <w:t xml:space="preserve"> </w:t>
+      </w:r>
+      <w:proofErr w:type="spellStart"/>
+      <w:r>
+        <w:rPr>
+          <w:rFonts w:ascii="Consolas" w:eastAsia="Times New Roman" w:hAnsi="Consolas" w:cs="Times New Roman"/>
+          <w:color w:val="CCCCCC"/>
+          <w:kern w:val="0"/>
+          <w:sz w:val="21"/>
+          <w:szCs w:val="21"/>
+          <w14:ligatures w14:val="none"/>
+        </w:rPr>
+        <w:t>tiktoken</w:t>
+      </w:r>
+      <w:proofErr w:type="spellEnd"/>
+      <w:r>
+        <w:rPr>
+          <w:rFonts w:ascii="Consolas" w:eastAsia="Times New Roman" w:hAnsi="Consolas" w:cs="Times New Roman"/>
+          <w:color w:val="CCCCCC"/>
+          <w:kern w:val="0"/>
+          <w:sz w:val="21"/>
+          <w:szCs w:val="21"/>
+          <w14:ligatures w14:val="none"/>
+        </w:rPr>
+        <w:t xml:space="preserve"> </w:t>
+      </w:r>
+      <w:proofErr w:type="spellStart"/>
+      <w:r>
+        <w:rPr>
+          <w:rFonts w:ascii="Consolas" w:eastAsia="Times New Roman" w:hAnsi="Consolas" w:cs="Times New Roman"/>
+          <w:color w:val="CCCCCC"/>
+          <w:kern w:val="0"/>
+          <w:sz w:val="21"/>
+          <w:szCs w:val="21"/>
+          <w14:ligatures w14:val="none"/>
+        </w:rPr>
+        <w:t>rapidocr</w:t>
       </w:r>
       <w:r>
         <w:rPr>
@@ -1010,7 +1304,19 @@
           <w:szCs w:val="21"/>
           <w14:ligatures w14:val="none"/>
         </w:rPr>
-        <w:t>onnxruntime python</w:t>
+        <w:t>onnxruntime</w:t>
+      </w:r>
+      <w:proofErr w:type="spellEnd"/>
+      <w:r>
+        <w:rPr>
+          <w:rFonts w:ascii="Consolas" w:eastAsia="Times New Roman" w:hAnsi="Consolas" w:cs="Times New Roman"/>
+          <w:color w:val="CCCCCC"/>
+          <w:kern w:val="0"/>
+          <w:sz w:val="21"/>
+          <w:szCs w:val="21"/>
+          <w14:ligatures w14:val="none"/>
+        </w:rPr>
+        <w:t xml:space="preserve"> python</w:t>
       </w:r>
       <w:r>
         <w:rPr>
@@ -1023,6 +1329,7 @@
         </w:rPr>
         <w:t>-</w:t>
       </w:r>
+      <w:proofErr w:type="spellStart"/>
       <w:r>
         <w:rPr>
           <w:rFonts w:ascii="Consolas" w:eastAsia="Times New Roman" w:hAnsi="Consolas" w:cs="Times New Roman"/>
@@ -1032,8 +1339,33 @@
           <w:szCs w:val="21"/>
           <w14:ligatures w14:val="none"/>
         </w:rPr>
-        <w:t>dotenv langchain</w:t>
-      </w:r>
+        <w:t>dotenv</w:t>
+      </w:r>
+      <w:proofErr w:type="spellEnd"/>
+      <w:r>
+        <w:rPr>
+          <w:rFonts w:ascii="Consolas" w:eastAsia="Times New Roman" w:hAnsi="Consolas" w:cs="Times New Roman"/>
+          <w:color w:val="CCCCCC"/>
+          <w:kern w:val="0"/>
+          <w:sz w:val="21"/>
+          <w:szCs w:val="21"/>
+          <w14:ligatures w14:val="none"/>
+        </w:rPr>
+        <w:t xml:space="preserve"> </w:t>
+      </w:r>
+      <w:proofErr w:type="spellStart"/>
+      <w:r>
+        <w:rPr>
+          <w:rFonts w:ascii="Consolas" w:eastAsia="Times New Roman" w:hAnsi="Consolas" w:cs="Times New Roman"/>
+          <w:color w:val="CCCCCC"/>
+          <w:kern w:val="0"/>
+          <w:sz w:val="21"/>
+          <w:szCs w:val="21"/>
+          <w14:ligatures w14:val="none"/>
+        </w:rPr>
+        <w:t>langchain</w:t>
+      </w:r>
+      <w:proofErr w:type="spellEnd"/>
       <w:r>
         <w:rPr>
           <w:rFonts w:ascii="Consolas" w:eastAsia="Times New Roman" w:hAnsi="Consolas" w:cs="Times New Roman"/>
@@ -1065,45 +1397,39 @@
           <w:numId w:val="2"/>
         </w:numPr>
       </w:pPr>
-      <w:r>
-        <w:t>uv pip list</w:t>
-      </w:r>
-      <w:r>
-        <w:t xml:space="preserve">  (This is use for check the packages list that are installed and used our project)</w:t>
-      </w:r>
-    </w:p>
-    <w:p>
-      <w:pPr>
-        <w:pStyle w:val="ListParagraph"/>
-        <w:numPr>
-          <w:ilvl w:val="0"/>
-          <w:numId w:val="2"/>
-        </w:numPr>
-        <w:rPr>
-          <w:b/>
-          <w:bCs/>
-        </w:rPr>
-      </w:pPr>
-      <w:r>
-        <w:rPr>
-          <w:b/>
-          <w:bCs/>
-        </w:rPr>
-        <w:t>What is data ingestion?</w:t>
-      </w:r>
-    </w:p>
-    <w:p>
-      <w:pPr>
-        <w:pStyle w:val="ListParagraph"/>
-        <w:numPr>
-          <w:ilvl w:val="0"/>
-          <w:numId w:val="2"/>
-        </w:numPr>
-        <w:rPr>
-          <w:b/>
-          <w:bCs/>
-        </w:rPr>
-      </w:pPr>
+      <w:proofErr w:type="spellStart"/>
+      <w:r>
+        <w:t>uv</w:t>
+      </w:r>
+      <w:proofErr w:type="spellEnd"/>
+      <w:r>
+        <w:t xml:space="preserve"> pip </w:t>
+      </w:r>
+      <w:proofErr w:type="gramStart"/>
+      <w:r>
+        <w:t>list</w:t>
+      </w:r>
+      <w:r>
+        <w:t xml:space="preserve">  (</w:t>
+      </w:r>
+      <w:proofErr w:type="gramEnd"/>
+      <w:r>
+        <w:t>This is use for check the packages list that are installed and used our project)</w:t>
+      </w:r>
+    </w:p>
+    <w:p>
+      <w:pPr>
+        <w:pStyle w:val="ListParagraph"/>
+        <w:numPr>
+          <w:ilvl w:val="0"/>
+          <w:numId w:val="2"/>
+        </w:numPr>
+        <w:rPr>
+          <w:b/>
+          <w:bCs/>
+        </w:rPr>
+      </w:pPr>
+      <w:proofErr w:type="spellStart"/>
       <w:r>
         <w:rPr>
           <w:b/>
@@ -1111,6 +1437,7 @@
         </w:rPr>
         <w:t>HuggingFaceEmbeddings</w:t>
       </w:r>
+      <w:proofErr w:type="spellEnd"/>
       <w:r>
         <w:rPr>
           <w:b/>
@@ -1131,6 +1458,7 @@
           <w:bCs/>
         </w:rPr>
       </w:pPr>
+      <w:proofErr w:type="spellStart"/>
       <w:r>
         <w:rPr>
           <w:b/>
@@ -1138,6 +1466,7 @@
         </w:rPr>
         <w:t>OpenAIEmbeddings</w:t>
       </w:r>
+      <w:proofErr w:type="spellEnd"/>
       <w:r>
         <w:rPr>
           <w:b/>
@@ -1158,6 +1487,7 @@
           <w:bCs/>
         </w:rPr>
       </w:pPr>
+      <w:proofErr w:type="spellStart"/>
       <w:r>
         <w:rPr>
           <w:b/>
@@ -1165,6 +1495,7 @@
         </w:rPr>
         <w:t>EmbeddingFactory</w:t>
       </w:r>
+      <w:proofErr w:type="spellEnd"/>
       <w:r>
         <w:rPr>
           <w:b/>
@@ -1192,6 +1523,7 @@
         </w:rPr>
         <w:t xml:space="preserve">What is </w:t>
       </w:r>
+      <w:proofErr w:type="spellStart"/>
       <w:r>
         <w:rPr>
           <w:b/>
@@ -1199,13 +1531,39 @@
         </w:rPr>
         <w:t>RecursiveCharacterTextSplitter</w:t>
       </w:r>
-      <w:r>
-        <w:rPr>
-          <w:b/>
-          <w:bCs/>
-        </w:rPr>
-        <w:t>, chunk_size &amp; chunk_overlap</w:t>
-      </w:r>
+      <w:proofErr w:type="spellEnd"/>
+      <w:r>
+        <w:rPr>
+          <w:b/>
+          <w:bCs/>
+        </w:rPr>
+        <w:t xml:space="preserve">, </w:t>
+      </w:r>
+      <w:proofErr w:type="spellStart"/>
+      <w:r>
+        <w:rPr>
+          <w:b/>
+          <w:bCs/>
+        </w:rPr>
+        <w:t>chunk_size</w:t>
+      </w:r>
+      <w:proofErr w:type="spellEnd"/>
+      <w:r>
+        <w:rPr>
+          <w:b/>
+          <w:bCs/>
+        </w:rPr>
+        <w:t xml:space="preserve"> &amp; </w:t>
+      </w:r>
+      <w:proofErr w:type="spellStart"/>
+      <w:r>
+        <w:rPr>
+          <w:b/>
+          <w:bCs/>
+        </w:rPr>
+        <w:t>chunk_overlap</w:t>
+      </w:r>
+      <w:proofErr w:type="spellEnd"/>
       <w:r>
         <w:rPr>
           <w:b/>
@@ -1226,6 +1584,7 @@
           <w:bCs/>
         </w:rPr>
       </w:pPr>
+      <w:proofErr w:type="spellStart"/>
       <w:r>
         <w:rPr>
           <w:b/>
@@ -1233,6 +1592,7 @@
         </w:rPr>
         <w:t>Chunkviz.up.railway.app</w:t>
       </w:r>
+      <w:proofErr w:type="spellEnd"/>
     </w:p>
     <w:p>
       <w:pPr>
@@ -1283,24 +1643,81 @@
           <w:b/>
           <w:bCs/>
         </w:rPr>
+        <w:t xml:space="preserve">I developed a production-ready full-stack </w:t>
+      </w:r>
+      <w:proofErr w:type="spellStart"/>
+      <w:r>
+        <w:rPr>
+          <w:b/>
+          <w:bCs/>
+        </w:rPr>
+        <w:t>LLMOps</w:t>
+      </w:r>
+      <w:proofErr w:type="spellEnd"/>
+      <w:r>
+        <w:rPr>
+          <w:b/>
+          <w:bCs/>
+        </w:rPr>
+        <w:t xml:space="preserve"> RAG chat system with modular architecture using </w:t>
+      </w:r>
+      <w:proofErr w:type="spellStart"/>
+      <w:r>
+        <w:rPr>
+          <w:b/>
+          <w:bCs/>
+        </w:rPr>
+        <w:t>FastAPI</w:t>
+      </w:r>
+      <w:proofErr w:type="spellEnd"/>
+      <w:r>
+        <w:rPr>
+          <w:b/>
+          <w:bCs/>
+        </w:rPr>
+        <w:t xml:space="preserve"> backend and Next.js frontend with centralized logging and error handling.</w:t>
+      </w:r>
+    </w:p>
+    <w:p>
+      <w:pPr>
+        <w:ind w:left="1080"/>
+        <w:rPr>
+          <w:b/>
+          <w:bCs/>
+        </w:rPr>
+      </w:pPr>
+      <w:proofErr w:type="spellStart"/>
+      <w:r>
+        <w:rPr>
+          <w:b/>
+          <w:bCs/>
+        </w:rPr>
         <w:lastRenderedPageBreak/>
-        <w:t>I developed a production-ready full-stack LLMOps RAG chat system with modular architecture using FastAPI backend and Next.js frontend with centralized logging and error handling.</w:t>
-      </w:r>
-    </w:p>
-    <w:p>
-      <w:pPr>
-        <w:ind w:left="1080"/>
-        <w:rPr>
-          <w:b/>
-          <w:bCs/>
-        </w:rPr>
-      </w:pPr>
-      <w:r>
-        <w:rPr>
-          <w:b/>
-          <w:bCs/>
-        </w:rPr>
-        <w:t>fullstack-llmops-rag-chat-system</w:t>
+        <w:t>fullstack</w:t>
+      </w:r>
+      <w:proofErr w:type="spellEnd"/>
+      <w:r>
+        <w:rPr>
+          <w:b/>
+          <w:bCs/>
+        </w:rPr>
+        <w:t>-</w:t>
+      </w:r>
+      <w:proofErr w:type="spellStart"/>
+      <w:r>
+        <w:rPr>
+          <w:b/>
+          <w:bCs/>
+        </w:rPr>
+        <w:t>llmops</w:t>
+      </w:r>
+      <w:proofErr w:type="spellEnd"/>
+      <w:r>
+        <w:rPr>
+          <w:b/>
+          <w:bCs/>
+        </w:rPr>
+        <w:t>-rag-chat-system</w:t>
       </w:r>
     </w:p>
     <w:p>
@@ -2137,6 +2554,7 @@
   <w:style w:type="character" w:default="1" w:styleId="DefaultParagraphFont">
     <w:name w:val="Default Paragraph Font"/>
     <w:uiPriority w:val="1"/>
+    <w:semiHidden/>
     <w:unhideWhenUsed/>
   </w:style>
   <w:style w:type="table" w:default="1" w:styleId="TableNormal">

</xml_diff>